<commit_message>
ADD: DOC EN PDF
</commit_message>
<xml_diff>
--- a/webroot/doc/Documentos/Doc Microsoft API Calendar.docx
+++ b/webroot/doc/Documentos/Doc Microsoft API Calendar.docx
@@ -146,21 +146,7 @@
                                         <w:rPr>
                                           <w:color w:val="FFFFFF" w:themeColor="background1"/>
                                         </w:rPr>
-                                        <w:t xml:space="preserve">Alejandro De la </w:t>
-                                      </w:r>
-                                      <w:proofErr w:type="spellStart"/>
-                                      <w:r>
-                                        <w:rPr>
-                                          <w:color w:val="FFFFFF" w:themeColor="background1"/>
-                                        </w:rPr>
-                                        <w:t>Huerga</w:t>
-                                      </w:r>
-                                      <w:proofErr w:type="spellEnd"/>
-                                      <w:r>
-                                        <w:rPr>
-                                          <w:color w:val="FFFFFF" w:themeColor="background1"/>
-                                        </w:rPr>
-                                        <w:t xml:space="preserve"> – Álvaro García</w:t>
+                                        <w:t>Alejandro De la Huerga – Álvaro García</w:t>
                                       </w:r>
                                     </w:p>
                                   </w:sdtContent>
@@ -362,21 +348,7 @@
                                   <w:rPr>
                                     <w:color w:val="FFFFFF" w:themeColor="background1"/>
                                   </w:rPr>
-                                  <w:t xml:space="preserve">Alejandro De la </w:t>
-                                </w:r>
-                                <w:proofErr w:type="spellStart"/>
-                                <w:r>
-                                  <w:rPr>
-                                    <w:color w:val="FFFFFF" w:themeColor="background1"/>
-                                  </w:rPr>
-                                  <w:t>Huerga</w:t>
-                                </w:r>
-                                <w:proofErr w:type="spellEnd"/>
-                                <w:r>
-                                  <w:rPr>
-                                    <w:color w:val="FFFFFF" w:themeColor="background1"/>
-                                  </w:rPr>
-                                  <w:t xml:space="preserve"> – Álvaro García</w:t>
+                                  <w:t>Alejandro De la Huerga – Álvaro García</w:t>
                                 </w:r>
                               </w:p>
                             </w:sdtContent>
@@ -508,6 +480,336 @@
         </w:p>
       </w:sdtContent>
     </w:sdt>
+    <w:sdt>
+      <w:sdtPr>
+        <w:id w:val="-1209492155"/>
+        <w:docPartObj>
+          <w:docPartGallery w:val="Table of Contents"/>
+          <w:docPartUnique/>
+        </w:docPartObj>
+      </w:sdtPr>
+      <w:sdtEndPr>
+        <w:rPr>
+          <w:rFonts w:asciiTheme="minorHAnsi" w:eastAsiaTheme="minorHAnsi" w:hAnsiTheme="minorHAnsi" w:cstheme="minorBidi"/>
+          <w:b/>
+          <w:bCs/>
+          <w:color w:val="auto"/>
+          <w:kern w:val="2"/>
+          <w:sz w:val="24"/>
+          <w:szCs w:val="24"/>
+          <w:lang w:eastAsia="en-US"/>
+          <w14:ligatures w14:val="standardContextual"/>
+        </w:rPr>
+      </w:sdtEndPr>
+      <w:sdtContent>
+        <w:p>
+          <w:pPr>
+            <w:pStyle w:val="TtuloTDC"/>
+          </w:pPr>
+          <w:r>
+            <w:t>Contenido</w:t>
+          </w:r>
+        </w:p>
+        <w:p>
+          <w:pPr>
+            <w:pStyle w:val="TDC2"/>
+            <w:tabs>
+              <w:tab w:val="right" w:leader="dot" w:pos="8494"/>
+            </w:tabs>
+            <w:rPr>
+              <w:rFonts w:eastAsiaTheme="minorEastAsia"/>
+              <w:noProof/>
+              <w:lang w:eastAsia="es-ES"/>
+            </w:rPr>
+          </w:pPr>
+          <w:r>
+            <w:fldChar w:fldCharType="begin"/>
+          </w:r>
+          <w:r>
+            <w:instrText xml:space="preserve"> TOC \o "1-3" \h \z \u </w:instrText>
+          </w:r>
+          <w:r>
+            <w:fldChar w:fldCharType="separate"/>
+          </w:r>
+          <w:hyperlink w:anchor="_Toc224294636" w:history="1">
+            <w:r>
+              <w:rPr>
+                <w:rStyle w:val="Hipervnculo"/>
+                <w:noProof/>
+              </w:rPr>
+              <w:t>Introducción</w:t>
+            </w:r>
+            <w:r>
+              <w:rPr>
+                <w:noProof/>
+                <w:webHidden/>
+              </w:rPr>
+              <w:tab/>
+            </w:r>
+            <w:r>
+              <w:rPr>
+                <w:noProof/>
+                <w:webHidden/>
+              </w:rPr>
+              <w:fldChar w:fldCharType="begin"/>
+            </w:r>
+            <w:r>
+              <w:rPr>
+                <w:noProof/>
+                <w:webHidden/>
+              </w:rPr>
+              <w:instrText xml:space="preserve"> PAGEREF _Toc224294636 \h </w:instrText>
+            </w:r>
+            <w:r>
+              <w:rPr>
+                <w:noProof/>
+                <w:webHidden/>
+              </w:rPr>
+            </w:r>
+            <w:r>
+              <w:rPr>
+                <w:noProof/>
+                <w:webHidden/>
+              </w:rPr>
+              <w:fldChar w:fldCharType="separate"/>
+            </w:r>
+            <w:r>
+              <w:rPr>
+                <w:noProof/>
+                <w:webHidden/>
+              </w:rPr>
+              <w:t>2</w:t>
+            </w:r>
+            <w:r>
+              <w:rPr>
+                <w:noProof/>
+                <w:webHidden/>
+              </w:rPr>
+              <w:fldChar w:fldCharType="end"/>
+            </w:r>
+          </w:hyperlink>
+        </w:p>
+        <w:p>
+          <w:pPr>
+            <w:pStyle w:val="TDC2"/>
+            <w:tabs>
+              <w:tab w:val="right" w:leader="dot" w:pos="8494"/>
+            </w:tabs>
+            <w:rPr>
+              <w:rFonts w:eastAsiaTheme="minorEastAsia"/>
+              <w:noProof/>
+              <w:lang w:eastAsia="es-ES"/>
+            </w:rPr>
+          </w:pPr>
+          <w:hyperlink w:anchor="_Toc224294637" w:history="1">
+            <w:r>
+              <w:rPr>
+                <w:rStyle w:val="Hipervnculo"/>
+                <w:noProof/>
+              </w:rPr>
+              <w:t>Requisitos mínimos</w:t>
+            </w:r>
+            <w:r>
+              <w:rPr>
+                <w:noProof/>
+                <w:webHidden/>
+              </w:rPr>
+              <w:tab/>
+            </w:r>
+            <w:r>
+              <w:rPr>
+                <w:noProof/>
+                <w:webHidden/>
+              </w:rPr>
+              <w:fldChar w:fldCharType="begin"/>
+            </w:r>
+            <w:r>
+              <w:rPr>
+                <w:noProof/>
+                <w:webHidden/>
+              </w:rPr>
+              <w:instrText xml:space="preserve"> PAGEREF _Toc224294637 \h </w:instrText>
+            </w:r>
+            <w:r>
+              <w:rPr>
+                <w:noProof/>
+                <w:webHidden/>
+              </w:rPr>
+            </w:r>
+            <w:r>
+              <w:rPr>
+                <w:noProof/>
+                <w:webHidden/>
+              </w:rPr>
+              <w:fldChar w:fldCharType="separate"/>
+            </w:r>
+            <w:r>
+              <w:rPr>
+                <w:noProof/>
+                <w:webHidden/>
+              </w:rPr>
+              <w:t>2</w:t>
+            </w:r>
+            <w:r>
+              <w:rPr>
+                <w:noProof/>
+                <w:webHidden/>
+              </w:rPr>
+              <w:fldChar w:fldCharType="end"/>
+            </w:r>
+          </w:hyperlink>
+        </w:p>
+        <w:p>
+          <w:pPr>
+            <w:pStyle w:val="TDC2"/>
+            <w:tabs>
+              <w:tab w:val="right" w:leader="dot" w:pos="8494"/>
+            </w:tabs>
+            <w:rPr>
+              <w:rFonts w:eastAsiaTheme="minorEastAsia"/>
+              <w:noProof/>
+              <w:lang w:eastAsia="es-ES"/>
+            </w:rPr>
+          </w:pPr>
+          <w:hyperlink w:anchor="_Toc224294638" w:history="1">
+            <w:r>
+              <w:rPr>
+                <w:rStyle w:val="Hipervnculo"/>
+                <w:noProof/>
+              </w:rPr>
+              <w:t>Portal Microsoft Azure</w:t>
+            </w:r>
+            <w:r>
+              <w:rPr>
+                <w:noProof/>
+                <w:webHidden/>
+              </w:rPr>
+              <w:tab/>
+            </w:r>
+            <w:r>
+              <w:rPr>
+                <w:noProof/>
+                <w:webHidden/>
+              </w:rPr>
+              <w:fldChar w:fldCharType="begin"/>
+            </w:r>
+            <w:r>
+              <w:rPr>
+                <w:noProof/>
+                <w:webHidden/>
+              </w:rPr>
+              <w:instrText xml:space="preserve"> PAGEREF _Toc224294638 \h </w:instrText>
+            </w:r>
+            <w:r>
+              <w:rPr>
+                <w:noProof/>
+                <w:webHidden/>
+              </w:rPr>
+            </w:r>
+            <w:r>
+              <w:rPr>
+                <w:noProof/>
+                <w:webHidden/>
+              </w:rPr>
+              <w:fldChar w:fldCharType="separate"/>
+            </w:r>
+            <w:r>
+              <w:rPr>
+                <w:noProof/>
+                <w:webHidden/>
+              </w:rPr>
+              <w:t>3</w:t>
+            </w:r>
+            <w:r>
+              <w:rPr>
+                <w:noProof/>
+                <w:webHidden/>
+              </w:rPr>
+              <w:fldChar w:fldCharType="end"/>
+            </w:r>
+          </w:hyperlink>
+        </w:p>
+        <w:p>
+          <w:pPr>
+            <w:pStyle w:val="TDC2"/>
+            <w:tabs>
+              <w:tab w:val="right" w:leader="dot" w:pos="8494"/>
+            </w:tabs>
+            <w:rPr>
+              <w:rFonts w:eastAsiaTheme="minorEastAsia"/>
+              <w:noProof/>
+              <w:lang w:eastAsia="es-ES"/>
+            </w:rPr>
+          </w:pPr>
+          <w:hyperlink w:anchor="_Toc224294639" w:history="1">
+            <w:r>
+              <w:rPr>
+                <w:rStyle w:val="Hipervnculo"/>
+                <w:noProof/>
+              </w:rPr>
+              <w:t>Instalación de dependencias</w:t>
+            </w:r>
+            <w:r>
+              <w:rPr>
+                <w:noProof/>
+                <w:webHidden/>
+              </w:rPr>
+              <w:tab/>
+            </w:r>
+            <w:r>
+              <w:rPr>
+                <w:noProof/>
+                <w:webHidden/>
+              </w:rPr>
+              <w:fldChar w:fldCharType="begin"/>
+            </w:r>
+            <w:r>
+              <w:rPr>
+                <w:noProof/>
+                <w:webHidden/>
+              </w:rPr>
+              <w:instrText xml:space="preserve"> PAGEREF _Toc224294639 \h </w:instrText>
+            </w:r>
+            <w:r>
+              <w:rPr>
+                <w:noProof/>
+                <w:webHidden/>
+              </w:rPr>
+            </w:r>
+            <w:r>
+              <w:rPr>
+                <w:noProof/>
+                <w:webHidden/>
+              </w:rPr>
+              <w:fldChar w:fldCharType="separate"/>
+            </w:r>
+            <w:r>
+              <w:rPr>
+                <w:noProof/>
+                <w:webHidden/>
+              </w:rPr>
+              <w:t>8</w:t>
+            </w:r>
+            <w:r>
+              <w:rPr>
+                <w:noProof/>
+                <w:webHidden/>
+              </w:rPr>
+              <w:fldChar w:fldCharType="end"/>
+            </w:r>
+          </w:hyperlink>
+        </w:p>
+        <w:p>
+          <w:r>
+            <w:rPr>
+              <w:b/>
+              <w:bCs/>
+            </w:rPr>
+            <w:fldChar w:fldCharType="end"/>
+          </w:r>
+        </w:p>
+      </w:sdtContent>
+    </w:sdt>
     <w:p/>
     <w:p/>
     <w:p/>
@@ -530,20 +832,17 @@
     <w:p/>
     <w:p/>
     <w:p/>
-    <w:p/>
-    <w:p/>
-    <w:p/>
-    <w:p/>
-    <w:p/>
     <w:p>
       <w:pPr>
         <w:pStyle w:val="Ttulo2"/>
         <w:jc w:val="both"/>
       </w:pPr>
+      <w:bookmarkStart w:id="0" w:name="_Toc224294636"/>
       <w:r>
         <w:lastRenderedPageBreak/>
         <w:t>Introducción</w:t>
       </w:r>
+      <w:bookmarkEnd w:id="0"/>
     </w:p>
     <w:p>
       <w:pPr>
@@ -646,7 +945,7 @@
         </w:rPr>
         <w:t xml:space="preserve">Documentación oficial: </w:t>
       </w:r>
-      <w:hyperlink r:id="rId7" w:history="1">
+      <w:hyperlink r:id="rId8" w:history="1">
         <w:r>
           <w:rPr>
             <w:rStyle w:val="Hipervnculo"/>
@@ -721,9 +1020,11 @@
         <w:pStyle w:val="Ttulo2"/>
         <w:jc w:val="both"/>
       </w:pPr>
+      <w:bookmarkStart w:id="1" w:name="_Toc224294637"/>
       <w:r>
         <w:t>Requisitos mínimos</w:t>
       </w:r>
+      <w:bookmarkEnd w:id="1"/>
     </w:p>
     <w:p>
       <w:pPr>
@@ -764,17 +1065,7 @@
         <w:t xml:space="preserve">: </w:t>
       </w:r>
       <w:r>
-        <w:t>Cualquier cuenta de dominio Microsoft es válida para realizar la integración (</w:t>
-      </w:r>
-      <w:proofErr w:type="spellStart"/>
-      <w:proofErr w:type="gramStart"/>
-      <w:r>
-        <w:t>Hotmail,Outlook</w:t>
-      </w:r>
-      <w:proofErr w:type="spellEnd"/>
-      <w:proofErr w:type="gramEnd"/>
-      <w:r>
-        <w:t>…).</w:t>
+        <w:t>Cualquier cuenta de dominio Microsoft es válida para realizar la integración (Hotmail,Outlook…).</w:t>
       </w:r>
     </w:p>
     <w:p>
@@ -790,7 +1081,7 @@
           <w:bCs/>
         </w:rPr>
       </w:pPr>
-      <w:hyperlink r:id="rId8" w:history="1">
+      <w:hyperlink r:id="rId9" w:history="1">
         <w:r>
           <w:rPr>
             <w:rStyle w:val="Hipervnculo"/>
@@ -899,24 +1190,10 @@
     </w:p>
     <w:p>
       <w:pPr>
-        <w:rPr>
-          <w:b/>
-          <w:bCs/>
-        </w:rPr>
-      </w:pPr>
-    </w:p>
-    <w:p>
-      <w:pPr>
-        <w:rPr>
-          <w:b/>
-          <w:bCs/>
-        </w:rPr>
-      </w:pPr>
-    </w:p>
-    <w:p>
-      <w:pPr>
         <w:pStyle w:val="Ttulo2"/>
-      </w:pPr>
+        <w:jc w:val="both"/>
+      </w:pPr>
+      <w:bookmarkStart w:id="2" w:name="_Toc224294638"/>
     </w:p>
     <w:p>
       <w:pPr>
@@ -926,6 +1203,7 @@
       <w:r>
         <w:t>Portal Microsoft Azure</w:t>
       </w:r>
+      <w:bookmarkEnd w:id="2"/>
     </w:p>
     <w:p>
       <w:pPr>
@@ -939,10 +1217,1157 @@
       <w:pPr>
         <w:jc w:val="both"/>
       </w:pPr>
+      <w:r>
+        <w:t xml:space="preserve">Una vez iniciado sesión debemos dirigirnos al </w:t>
+      </w:r>
+      <w:hyperlink r:id="rId10" w:tgtFrame="_blank" w:history="1">
+        <w:r>
+          <w:rPr>
+            <w:rStyle w:val="Hipervnculo"/>
+          </w:rPr>
+          <w:t>Centro de administración de Microsoft Entra (Azure AD)</w:t>
+        </w:r>
+      </w:hyperlink>
+      <w:r>
+        <w:t>.</w:t>
+      </w:r>
+    </w:p>
+    <w:p>
+      <w:pPr>
+        <w:jc w:val="both"/>
+      </w:pPr>
+      <w:r>
+        <w:t xml:space="preserve">El siguiente paso será dirigirnos al apartado que dice </w:t>
+      </w:r>
+      <w:r>
+        <w:rPr>
+          <w:b/>
+          <w:bCs/>
+        </w:rPr>
+        <w:t xml:space="preserve">“Todos los servicios” </w:t>
+      </w:r>
+      <w:r>
+        <w:t>, suele encontrase en el menú lateral izquierdo.</w:t>
+      </w:r>
+    </w:p>
+    <w:p>
+      <w:pPr>
+        <w:jc w:val="both"/>
+        <w:rPr>
+          <w:b/>
+          <w:bCs/>
+        </w:rPr>
+      </w:pPr>
+      <w:r>
+        <w:t xml:space="preserve">Una vez allí en el buscador, buscaremos el servicio llamado </w:t>
+      </w:r>
+      <w:r>
+        <w:rPr>
+          <w:b/>
+          <w:bCs/>
+        </w:rPr>
+        <w:t>“Registro de aplicaciones”</w:t>
+      </w:r>
+      <w:r>
+        <w:rPr>
+          <w:b/>
+          <w:bCs/>
+        </w:rPr>
+        <w:t>.</w:t>
+      </w:r>
+    </w:p>
+    <w:p>
+      <w:pPr>
+        <w:jc w:val="both"/>
+      </w:pPr>
+    </w:p>
+    <w:p>
+      <w:pPr>
+        <w:jc w:val="both"/>
+      </w:pPr>
+      <w:r>
+        <w:rPr>
+          <w:noProof/>
+        </w:rPr>
+        <w:drawing>
+          <wp:inline distT="0" distB="0" distL="0" distR="0" wp14:anchorId="3349F162" wp14:editId="3A5BC279">
+            <wp:extent cx="5400040" cy="1739900"/>
+            <wp:effectExtent l="0" t="0" r="0" b="0"/>
+            <wp:docPr id="1291293541" name="Imagen 5"/>
+            <wp:cNvGraphicFramePr>
+              <a:graphicFrameLocks xmlns:a="http://schemas.openxmlformats.org/drawingml/2006/main" noChangeAspect="1"/>
+            </wp:cNvGraphicFramePr>
+            <a:graphic xmlns:a="http://schemas.openxmlformats.org/drawingml/2006/main">
+              <a:graphicData uri="http://schemas.openxmlformats.org/drawingml/2006/picture">
+                <pic:pic xmlns:pic="http://schemas.openxmlformats.org/drawingml/2006/picture">
+                  <pic:nvPicPr>
+                    <pic:cNvPr id="1291293541" name="Imagen 1291293541"/>
+                    <pic:cNvPicPr/>
+                  </pic:nvPicPr>
+                  <pic:blipFill>
+                    <a:blip r:embed="rId11">
+                      <a:extLst>
+                        <a:ext uri="{28A0092B-C50C-407E-A947-70E740481C1C}">
+                          <a14:useLocalDpi xmlns:a14="http://schemas.microsoft.com/office/drawing/2010/main" val="0"/>
+                        </a:ext>
+                      </a:extLst>
+                    </a:blip>
+                    <a:stretch>
+                      <a:fillRect/>
+                    </a:stretch>
+                  </pic:blipFill>
+                  <pic:spPr>
+                    <a:xfrm>
+                      <a:off x="0" y="0"/>
+                      <a:ext cx="5400040" cy="1739900"/>
+                    </a:xfrm>
+                    <a:prstGeom prst="rect">
+                      <a:avLst/>
+                    </a:prstGeom>
+                  </pic:spPr>
+                </pic:pic>
+              </a:graphicData>
+            </a:graphic>
+          </wp:inline>
+        </w:drawing>
+      </w:r>
+    </w:p>
+    <w:p>
+      <w:pPr>
+        <w:jc w:val="both"/>
+        <w:rPr>
+          <w:b/>
+          <w:bCs/>
+        </w:rPr>
+      </w:pPr>
+      <w:r>
+        <w:t xml:space="preserve">Una vez accedamos al servicio citado anteriormente, nos dirigiremos a la sección que dice </w:t>
+      </w:r>
+      <w:r>
+        <w:rPr>
+          <w:b/>
+          <w:bCs/>
+        </w:rPr>
+        <w:t>“Nuevo Registro”</w:t>
+      </w:r>
+      <w:r>
+        <w:rPr>
+          <w:b/>
+          <w:bCs/>
+        </w:rPr>
+        <w:t>.</w:t>
+      </w:r>
+    </w:p>
+    <w:p>
+      <w:pPr>
+        <w:jc w:val="both"/>
+        <w:rPr>
+          <w:b/>
+          <w:bCs/>
+        </w:rPr>
+      </w:pPr>
+    </w:p>
+    <w:p>
+      <w:pPr>
+        <w:jc w:val="both"/>
+      </w:pPr>
+      <w:r>
+        <w:rPr>
+          <w:noProof/>
+        </w:rPr>
+        <w:drawing>
+          <wp:inline distT="0" distB="0" distL="0" distR="0" wp14:anchorId="3465F553" wp14:editId="6DABAC25">
+            <wp:extent cx="5400040" cy="1888490"/>
+            <wp:effectExtent l="0" t="0" r="0" b="0"/>
+            <wp:docPr id="1578803757" name="Imagen 6"/>
+            <wp:cNvGraphicFramePr>
+              <a:graphicFrameLocks xmlns:a="http://schemas.openxmlformats.org/drawingml/2006/main" noChangeAspect="1"/>
+            </wp:cNvGraphicFramePr>
+            <a:graphic xmlns:a="http://schemas.openxmlformats.org/drawingml/2006/main">
+              <a:graphicData uri="http://schemas.openxmlformats.org/drawingml/2006/picture">
+                <pic:pic xmlns:pic="http://schemas.openxmlformats.org/drawingml/2006/picture">
+                  <pic:nvPicPr>
+                    <pic:cNvPr id="1578803757" name="Imagen 1578803757"/>
+                    <pic:cNvPicPr/>
+                  </pic:nvPicPr>
+                  <pic:blipFill>
+                    <a:blip r:embed="rId12">
+                      <a:extLst>
+                        <a:ext uri="{28A0092B-C50C-407E-A947-70E740481C1C}">
+                          <a14:useLocalDpi xmlns:a14="http://schemas.microsoft.com/office/drawing/2010/main" val="0"/>
+                        </a:ext>
+                      </a:extLst>
+                    </a:blip>
+                    <a:stretch>
+                      <a:fillRect/>
+                    </a:stretch>
+                  </pic:blipFill>
+                  <pic:spPr>
+                    <a:xfrm>
+                      <a:off x="0" y="0"/>
+                      <a:ext cx="5400040" cy="1888490"/>
+                    </a:xfrm>
+                    <a:prstGeom prst="rect">
+                      <a:avLst/>
+                    </a:prstGeom>
+                  </pic:spPr>
+                </pic:pic>
+              </a:graphicData>
+            </a:graphic>
+          </wp:inline>
+        </w:drawing>
+      </w:r>
+    </w:p>
+    <w:p>
+      <w:pPr>
+        <w:jc w:val="both"/>
+      </w:pPr>
+      <w:r>
+        <w:t>Ponle un nombre (ej. "</w:t>
+      </w:r>
+      <w:r>
+        <w:t>Correos</w:t>
+      </w:r>
+      <w:r>
+        <w:t>") y selecciona "Cuentas en cualquier directorio organizativo" si quieres que funcione con cualquier correo de Outlook/Hotmail.</w:t>
+      </w:r>
+    </w:p>
+    <w:p>
+      <w:pPr>
+        <w:jc w:val="both"/>
+      </w:pPr>
+    </w:p>
+    <w:p>
+      <w:pPr>
+        <w:jc w:val="both"/>
+        <w:rPr>
+          <w:b/>
+          <w:bCs/>
+        </w:rPr>
+      </w:pPr>
+      <w:r>
+        <w:lastRenderedPageBreak/>
+        <w:t xml:space="preserve">Una vez rellenado el formulario, pulsamos el botón de </w:t>
+      </w:r>
+      <w:r>
+        <w:rPr>
+          <w:b/>
+          <w:bCs/>
+        </w:rPr>
+        <w:t>“Registrar Aplicación”.</w:t>
+      </w:r>
+    </w:p>
+    <w:p>
+      <w:pPr>
+        <w:jc w:val="both"/>
+        <w:rPr>
+          <w:b/>
+          <w:bCs/>
+        </w:rPr>
+      </w:pPr>
+      <w:r>
+        <w:t xml:space="preserve">Se nos abrirá una nueva ventana la cual tendrá un menú lateral izquierdo diferente, debemos de dirigirnos a la sección </w:t>
+      </w:r>
+      <w:r>
+        <w:rPr>
+          <w:b/>
+          <w:bCs/>
+        </w:rPr>
+        <w:t>Administrar -&gt; Certificados y Secretos.</w:t>
+      </w:r>
+    </w:p>
+    <w:p>
+      <w:pPr>
+        <w:jc w:val="both"/>
+        <w:rPr>
+          <w:b/>
+          <w:bCs/>
+        </w:rPr>
+      </w:pPr>
+    </w:p>
+    <w:p>
+      <w:pPr>
+        <w:jc w:val="both"/>
+        <w:rPr>
+          <w:b/>
+          <w:bCs/>
+        </w:rPr>
+      </w:pPr>
+      <w:r>
+        <w:rPr>
+          <w:b/>
+          <w:bCs/>
+          <w:noProof/>
+        </w:rPr>
+        <w:drawing>
+          <wp:inline distT="0" distB="0" distL="0" distR="0" wp14:anchorId="6BA0F488" wp14:editId="7F642BD1">
+            <wp:extent cx="2695951" cy="1733792"/>
+            <wp:effectExtent l="0" t="0" r="9525" b="0"/>
+            <wp:docPr id="1418247115" name="Imagen 8"/>
+            <wp:cNvGraphicFramePr>
+              <a:graphicFrameLocks xmlns:a="http://schemas.openxmlformats.org/drawingml/2006/main" noChangeAspect="1"/>
+            </wp:cNvGraphicFramePr>
+            <a:graphic xmlns:a="http://schemas.openxmlformats.org/drawingml/2006/main">
+              <a:graphicData uri="http://schemas.openxmlformats.org/drawingml/2006/picture">
+                <pic:pic xmlns:pic="http://schemas.openxmlformats.org/drawingml/2006/picture">
+                  <pic:nvPicPr>
+                    <pic:cNvPr id="1418247115" name="Imagen 1418247115"/>
+                    <pic:cNvPicPr/>
+                  </pic:nvPicPr>
+                  <pic:blipFill>
+                    <a:blip r:embed="rId13">
+                      <a:extLst>
+                        <a:ext uri="{28A0092B-C50C-407E-A947-70E740481C1C}">
+                          <a14:useLocalDpi xmlns:a14="http://schemas.microsoft.com/office/drawing/2010/main" val="0"/>
+                        </a:ext>
+                      </a:extLst>
+                    </a:blip>
+                    <a:stretch>
+                      <a:fillRect/>
+                    </a:stretch>
+                  </pic:blipFill>
+                  <pic:spPr>
+                    <a:xfrm>
+                      <a:off x="0" y="0"/>
+                      <a:ext cx="2695951" cy="1733792"/>
+                    </a:xfrm>
+                    <a:prstGeom prst="rect">
+                      <a:avLst/>
+                    </a:prstGeom>
+                  </pic:spPr>
+                </pic:pic>
+              </a:graphicData>
+            </a:graphic>
+          </wp:inline>
+        </w:drawing>
+      </w:r>
+    </w:p>
+    <w:p>
+      <w:pPr>
+        <w:jc w:val="both"/>
+        <w:rPr>
+          <w:b/>
+          <w:bCs/>
+        </w:rPr>
+      </w:pPr>
+    </w:p>
+    <w:p>
+      <w:pPr>
+        <w:jc w:val="both"/>
+        <w:rPr>
+          <w:b/>
+          <w:bCs/>
+        </w:rPr>
+      </w:pPr>
+      <w:r>
+        <w:t>La venta central de la página web se cambiara y veremos la sección de Certificados y Secretos, ahí debemos hacer click en</w:t>
+      </w:r>
+      <w:r>
+        <w:rPr>
+          <w:b/>
+          <w:bCs/>
+        </w:rPr>
+        <w:t xml:space="preserve"> “Nuevo Secreto de Cliente”.</w:t>
+      </w:r>
+    </w:p>
+    <w:p>
+      <w:pPr>
+        <w:jc w:val="both"/>
+        <w:rPr>
+          <w:b/>
+          <w:bCs/>
+        </w:rPr>
+      </w:pPr>
+      <w:r>
+        <w:rPr>
+          <w:b/>
+          <w:bCs/>
+          <w:noProof/>
+        </w:rPr>
+        <w:drawing>
+          <wp:inline distT="0" distB="0" distL="0" distR="0" wp14:anchorId="47EF7678" wp14:editId="175551E1">
+            <wp:extent cx="4970780" cy="1459149"/>
+            <wp:effectExtent l="0" t="0" r="1270" b="8255"/>
+            <wp:docPr id="1922116161" name="Imagen 9"/>
+            <wp:cNvGraphicFramePr>
+              <a:graphicFrameLocks xmlns:a="http://schemas.openxmlformats.org/drawingml/2006/main" noChangeAspect="1"/>
+            </wp:cNvGraphicFramePr>
+            <a:graphic xmlns:a="http://schemas.openxmlformats.org/drawingml/2006/main">
+              <a:graphicData uri="http://schemas.openxmlformats.org/drawingml/2006/picture">
+                <pic:pic xmlns:pic="http://schemas.openxmlformats.org/drawingml/2006/picture">
+                  <pic:nvPicPr>
+                    <pic:cNvPr id="1922116161" name="Imagen 1922116161"/>
+                    <pic:cNvPicPr/>
+                  </pic:nvPicPr>
+                  <pic:blipFill>
+                    <a:blip r:embed="rId14">
+                      <a:extLst>
+                        <a:ext uri="{28A0092B-C50C-407E-A947-70E740481C1C}">
+                          <a14:useLocalDpi xmlns:a14="http://schemas.microsoft.com/office/drawing/2010/main" val="0"/>
+                        </a:ext>
+                      </a:extLst>
+                    </a:blip>
+                    <a:stretch>
+                      <a:fillRect/>
+                    </a:stretch>
+                  </pic:blipFill>
+                  <pic:spPr>
+                    <a:xfrm>
+                      <a:off x="0" y="0"/>
+                      <a:ext cx="4986750" cy="1463837"/>
+                    </a:xfrm>
+                    <a:prstGeom prst="rect">
+                      <a:avLst/>
+                    </a:prstGeom>
+                  </pic:spPr>
+                </pic:pic>
+              </a:graphicData>
+            </a:graphic>
+          </wp:inline>
+        </w:drawing>
+      </w:r>
+    </w:p>
+    <w:p>
+      <w:pPr>
+        <w:jc w:val="both"/>
+      </w:pPr>
+      <w:r>
+        <w:t>Aparece un menú lateral a la derecha de nuestra ventana el cual será un formulario donde debemos introducir el nombre y caducidad del secreto.</w:t>
+      </w:r>
+    </w:p>
+    <w:p>
+      <w:pPr>
+        <w:jc w:val="both"/>
+        <w:rPr>
+          <w:b/>
+          <w:bCs/>
+        </w:rPr>
+      </w:pPr>
+      <w:r>
+        <w:rPr>
+          <w:b/>
+          <w:bCs/>
+          <w:highlight w:val="yellow"/>
+        </w:rPr>
+        <w:t>Antes de darla a registrar hay que tener en cuenta que el campo valor que aparezca hay que copiarlo rápidamente ya que si recargamos la página desaparecerá y tendremos que crear otro.</w:t>
+      </w:r>
+    </w:p>
+    <w:p>
+      <w:pPr>
+        <w:jc w:val="both"/>
+        <w:rPr>
+          <w:b/>
+          <w:bCs/>
+        </w:rPr>
+      </w:pPr>
+      <w:r>
+        <w:rPr>
+          <w:b/>
+          <w:bCs/>
+          <w:noProof/>
+        </w:rPr>
+        <w:drawing>
+          <wp:inline distT="0" distB="0" distL="0" distR="0" wp14:anchorId="44A70DFB" wp14:editId="374C8F7B">
+            <wp:extent cx="5400040" cy="1342417"/>
+            <wp:effectExtent l="0" t="0" r="0" b="0"/>
+            <wp:docPr id="853217439" name="Imagen 10"/>
+            <wp:cNvGraphicFramePr>
+              <a:graphicFrameLocks xmlns:a="http://schemas.openxmlformats.org/drawingml/2006/main" noChangeAspect="1"/>
+            </wp:cNvGraphicFramePr>
+            <a:graphic xmlns:a="http://schemas.openxmlformats.org/drawingml/2006/main">
+              <a:graphicData uri="http://schemas.openxmlformats.org/drawingml/2006/picture">
+                <pic:pic xmlns:pic="http://schemas.openxmlformats.org/drawingml/2006/picture">
+                  <pic:nvPicPr>
+                    <pic:cNvPr id="853217439" name="Imagen 853217439"/>
+                    <pic:cNvPicPr/>
+                  </pic:nvPicPr>
+                  <pic:blipFill>
+                    <a:blip r:embed="rId14">
+                      <a:extLst>
+                        <a:ext uri="{28A0092B-C50C-407E-A947-70E740481C1C}">
+                          <a14:useLocalDpi xmlns:a14="http://schemas.microsoft.com/office/drawing/2010/main" val="0"/>
+                        </a:ext>
+                      </a:extLst>
+                    </a:blip>
+                    <a:stretch>
+                      <a:fillRect/>
+                    </a:stretch>
+                  </pic:blipFill>
+                  <pic:spPr>
+                    <a:xfrm>
+                      <a:off x="0" y="0"/>
+                      <a:ext cx="5413472" cy="1345756"/>
+                    </a:xfrm>
+                    <a:prstGeom prst="rect">
+                      <a:avLst/>
+                    </a:prstGeom>
+                  </pic:spPr>
+                </pic:pic>
+              </a:graphicData>
+            </a:graphic>
+          </wp:inline>
+        </w:drawing>
+      </w:r>
+    </w:p>
+    <w:p>
+      <w:pPr>
+        <w:jc w:val="both"/>
+        <w:rPr>
+          <w:b/>
+          <w:bCs/>
+        </w:rPr>
+      </w:pPr>
+    </w:p>
+    <w:p>
+      <w:pPr>
+        <w:jc w:val="both"/>
+      </w:pPr>
+      <w:r>
+        <w:lastRenderedPageBreak/>
+        <w:t>Ya tenemos nuestro secreto de cliente listo:</w:t>
+      </w:r>
+    </w:p>
+    <w:p>
+      <w:pPr>
+        <w:jc w:val="both"/>
+        <w:rPr>
+          <w:b/>
+          <w:bCs/>
+        </w:rPr>
+      </w:pPr>
+      <w:r>
+        <w:rPr>
+          <w:b/>
+          <w:bCs/>
+          <w:noProof/>
+        </w:rPr>
+        <w:drawing>
+          <wp:inline distT="0" distB="0" distL="0" distR="0" wp14:anchorId="40E66F04" wp14:editId="5DD88DB4">
+            <wp:extent cx="5400040" cy="1964690"/>
+            <wp:effectExtent l="0" t="0" r="0" b="0"/>
+            <wp:docPr id="65684578" name="Imagen 11"/>
+            <wp:cNvGraphicFramePr>
+              <a:graphicFrameLocks xmlns:a="http://schemas.openxmlformats.org/drawingml/2006/main" noChangeAspect="1"/>
+            </wp:cNvGraphicFramePr>
+            <a:graphic xmlns:a="http://schemas.openxmlformats.org/drawingml/2006/main">
+              <a:graphicData uri="http://schemas.openxmlformats.org/drawingml/2006/picture">
+                <pic:pic xmlns:pic="http://schemas.openxmlformats.org/drawingml/2006/picture">
+                  <pic:nvPicPr>
+                    <pic:cNvPr id="65684578" name="Imagen 65684578"/>
+                    <pic:cNvPicPr/>
+                  </pic:nvPicPr>
+                  <pic:blipFill>
+                    <a:blip r:embed="rId15">
+                      <a:extLst>
+                        <a:ext uri="{28A0092B-C50C-407E-A947-70E740481C1C}">
+                          <a14:useLocalDpi xmlns:a14="http://schemas.microsoft.com/office/drawing/2010/main" val="0"/>
+                        </a:ext>
+                      </a:extLst>
+                    </a:blip>
+                    <a:stretch>
+                      <a:fillRect/>
+                    </a:stretch>
+                  </pic:blipFill>
+                  <pic:spPr>
+                    <a:xfrm>
+                      <a:off x="0" y="0"/>
+                      <a:ext cx="5400040" cy="1964690"/>
+                    </a:xfrm>
+                    <a:prstGeom prst="rect">
+                      <a:avLst/>
+                    </a:prstGeom>
+                  </pic:spPr>
+                </pic:pic>
+              </a:graphicData>
+            </a:graphic>
+          </wp:inline>
+        </w:drawing>
+      </w:r>
+    </w:p>
+    <w:p>
+      <w:pPr>
+        <w:jc w:val="both"/>
+      </w:pPr>
+      <w:r>
+        <w:t>El siguiente paso será configurar los permisos de la API, ya que Microsoft por defecto solamente nos da por defecto permisos de lectura.</w:t>
+      </w:r>
+    </w:p>
+    <w:p>
+      <w:pPr>
+        <w:jc w:val="both"/>
+      </w:pPr>
+      <w:r>
+        <w:rPr>
+          <w:noProof/>
+        </w:rPr>
+        <w:drawing>
+          <wp:inline distT="0" distB="0" distL="0" distR="0" wp14:anchorId="50CC414C" wp14:editId="7788A425">
+            <wp:extent cx="2373549" cy="1898839"/>
+            <wp:effectExtent l="0" t="0" r="8255" b="6350"/>
+            <wp:docPr id="1908635949" name="Imagen 13"/>
+            <wp:cNvGraphicFramePr>
+              <a:graphicFrameLocks xmlns:a="http://schemas.openxmlformats.org/drawingml/2006/main" noChangeAspect="1"/>
+            </wp:cNvGraphicFramePr>
+            <a:graphic xmlns:a="http://schemas.openxmlformats.org/drawingml/2006/main">
+              <a:graphicData uri="http://schemas.openxmlformats.org/drawingml/2006/picture">
+                <pic:pic xmlns:pic="http://schemas.openxmlformats.org/drawingml/2006/picture">
+                  <pic:nvPicPr>
+                    <pic:cNvPr id="1908635949" name="Imagen 1908635949"/>
+                    <pic:cNvPicPr/>
+                  </pic:nvPicPr>
+                  <pic:blipFill>
+                    <a:blip r:embed="rId16">
+                      <a:extLst>
+                        <a:ext uri="{28A0092B-C50C-407E-A947-70E740481C1C}">
+                          <a14:useLocalDpi xmlns:a14="http://schemas.microsoft.com/office/drawing/2010/main" val="0"/>
+                        </a:ext>
+                      </a:extLst>
+                    </a:blip>
+                    <a:stretch>
+                      <a:fillRect/>
+                    </a:stretch>
+                  </pic:blipFill>
+                  <pic:spPr>
+                    <a:xfrm>
+                      <a:off x="0" y="0"/>
+                      <a:ext cx="2378058" cy="1902446"/>
+                    </a:xfrm>
+                    <a:prstGeom prst="rect">
+                      <a:avLst/>
+                    </a:prstGeom>
+                  </pic:spPr>
+                </pic:pic>
+              </a:graphicData>
+            </a:graphic>
+          </wp:inline>
+        </w:drawing>
+      </w:r>
+    </w:p>
+    <w:p>
+      <w:pPr>
+        <w:jc w:val="both"/>
+      </w:pPr>
+      <w:r>
+        <w:t>Se nos abrirá la ventana central para configurar permisos , como podemos comprobar solo tenemos permisos de lectura:</w:t>
+      </w:r>
+    </w:p>
+    <w:p>
+      <w:pPr>
+        <w:jc w:val="both"/>
+      </w:pPr>
+      <w:r>
+        <w:rPr>
+          <w:noProof/>
+        </w:rPr>
+        <w:drawing>
+          <wp:inline distT="0" distB="0" distL="0" distR="0" wp14:anchorId="45747F20" wp14:editId="12449E80">
+            <wp:extent cx="5116749" cy="2312035"/>
+            <wp:effectExtent l="0" t="0" r="8255" b="0"/>
+            <wp:docPr id="27073765" name="Imagen 14"/>
+            <wp:cNvGraphicFramePr>
+              <a:graphicFrameLocks xmlns:a="http://schemas.openxmlformats.org/drawingml/2006/main" noChangeAspect="1"/>
+            </wp:cNvGraphicFramePr>
+            <a:graphic xmlns:a="http://schemas.openxmlformats.org/drawingml/2006/main">
+              <a:graphicData uri="http://schemas.openxmlformats.org/drawingml/2006/picture">
+                <pic:pic xmlns:pic="http://schemas.openxmlformats.org/drawingml/2006/picture">
+                  <pic:nvPicPr>
+                    <pic:cNvPr id="27073765" name="Imagen 27073765"/>
+                    <pic:cNvPicPr/>
+                  </pic:nvPicPr>
+                  <pic:blipFill>
+                    <a:blip r:embed="rId17">
+                      <a:extLst>
+                        <a:ext uri="{28A0092B-C50C-407E-A947-70E740481C1C}">
+                          <a14:useLocalDpi xmlns:a14="http://schemas.microsoft.com/office/drawing/2010/main" val="0"/>
+                        </a:ext>
+                      </a:extLst>
+                    </a:blip>
+                    <a:stretch>
+                      <a:fillRect/>
+                    </a:stretch>
+                  </pic:blipFill>
+                  <pic:spPr>
+                    <a:xfrm>
+                      <a:off x="0" y="0"/>
+                      <a:ext cx="5135594" cy="2320550"/>
+                    </a:xfrm>
+                    <a:prstGeom prst="rect">
+                      <a:avLst/>
+                    </a:prstGeom>
+                  </pic:spPr>
+                </pic:pic>
+              </a:graphicData>
+            </a:graphic>
+          </wp:inline>
+        </w:drawing>
+      </w:r>
+    </w:p>
+    <w:p>
+      <w:pPr>
+        <w:jc w:val="both"/>
+      </w:pPr>
+    </w:p>
+    <w:p>
+      <w:pPr>
+        <w:jc w:val="both"/>
+      </w:pPr>
+    </w:p>
+    <w:p>
+      <w:pPr>
+        <w:jc w:val="both"/>
+        <w:rPr>
+          <w:b/>
+          <w:bCs/>
+        </w:rPr>
+      </w:pPr>
+      <w:r>
+        <w:lastRenderedPageBreak/>
+        <w:t xml:space="preserve">Haremos click en el botón de </w:t>
+      </w:r>
+      <w:r>
+        <w:t>“</w:t>
+      </w:r>
+      <w:r>
+        <w:rPr>
+          <w:b/>
+          <w:bCs/>
+        </w:rPr>
+        <w:t>Agregar un permiso</w:t>
+      </w:r>
+      <w:r>
+        <w:rPr>
+          <w:b/>
+          <w:bCs/>
+        </w:rPr>
+        <w:t>”</w:t>
+      </w:r>
+      <w:r>
+        <w:rPr>
+          <w:b/>
+          <w:bCs/>
+        </w:rPr>
+        <w:t xml:space="preserve"> </w:t>
+      </w:r>
+      <w:r>
+        <w:t xml:space="preserve">y elegiremos la </w:t>
+      </w:r>
+      <w:r>
+        <w:t>opción</w:t>
+      </w:r>
+      <w:r>
+        <w:rPr>
+          <w:b/>
+          <w:bCs/>
+        </w:rPr>
+        <w:t xml:space="preserve"> “Microsoft Graph”.</w:t>
+      </w:r>
+    </w:p>
+    <w:p>
+      <w:pPr>
+        <w:jc w:val="both"/>
+      </w:pPr>
+      <w:r>
+        <w:rPr>
+          <w:noProof/>
+        </w:rPr>
+        <w:drawing>
+          <wp:inline distT="0" distB="0" distL="0" distR="0" wp14:anchorId="523BD91A" wp14:editId="237C0BCA">
+            <wp:extent cx="3998068" cy="2491105"/>
+            <wp:effectExtent l="0" t="0" r="2540" b="4445"/>
+            <wp:docPr id="2110575054" name="Imagen 15"/>
+            <wp:cNvGraphicFramePr>
+              <a:graphicFrameLocks xmlns:a="http://schemas.openxmlformats.org/drawingml/2006/main" noChangeAspect="1"/>
+            </wp:cNvGraphicFramePr>
+            <a:graphic xmlns:a="http://schemas.openxmlformats.org/drawingml/2006/main">
+              <a:graphicData uri="http://schemas.openxmlformats.org/drawingml/2006/picture">
+                <pic:pic xmlns:pic="http://schemas.openxmlformats.org/drawingml/2006/picture">
+                  <pic:nvPicPr>
+                    <pic:cNvPr id="2110575054" name="Imagen 2110575054"/>
+                    <pic:cNvPicPr/>
+                  </pic:nvPicPr>
+                  <pic:blipFill>
+                    <a:blip r:embed="rId18">
+                      <a:extLst>
+                        <a:ext uri="{28A0092B-C50C-407E-A947-70E740481C1C}">
+                          <a14:useLocalDpi xmlns:a14="http://schemas.microsoft.com/office/drawing/2010/main" val="0"/>
+                        </a:ext>
+                      </a:extLst>
+                    </a:blip>
+                    <a:stretch>
+                      <a:fillRect/>
+                    </a:stretch>
+                  </pic:blipFill>
+                  <pic:spPr>
+                    <a:xfrm>
+                      <a:off x="0" y="0"/>
+                      <a:ext cx="4012835" cy="2500306"/>
+                    </a:xfrm>
+                    <a:prstGeom prst="rect">
+                      <a:avLst/>
+                    </a:prstGeom>
+                  </pic:spPr>
+                </pic:pic>
+              </a:graphicData>
+            </a:graphic>
+          </wp:inline>
+        </w:drawing>
+      </w:r>
+    </w:p>
+    <w:p>
+      <w:pPr>
+        <w:jc w:val="both"/>
+      </w:pPr>
+    </w:p>
+    <w:p>
+      <w:pPr>
+        <w:jc w:val="both"/>
+        <w:rPr>
+          <w:b/>
+          <w:bCs/>
+        </w:rPr>
+      </w:pPr>
+      <w:r>
+        <w:rPr>
+          <w:b/>
+          <w:bCs/>
+        </w:rPr>
+        <w:t>En la siguiente ventana debemos elegir entre:</w:t>
+      </w:r>
+    </w:p>
+    <w:p>
+      <w:pPr>
+        <w:pStyle w:val="Prrafodelista"/>
+        <w:numPr>
+          <w:ilvl w:val="0"/>
+          <w:numId w:val="2"/>
+        </w:numPr>
+        <w:jc w:val="both"/>
+        <w:rPr>
+          <w:b/>
+          <w:bCs/>
+        </w:rPr>
+      </w:pPr>
+      <w:r>
+        <w:rPr>
+          <w:b/>
+          <w:bCs/>
+        </w:rPr>
+        <w:t xml:space="preserve">Permisos delegados: </w:t>
+      </w:r>
+      <w:r>
+        <w:t>El usuario debe iniciar sesión antes.</w:t>
+      </w:r>
+    </w:p>
+    <w:p>
+      <w:pPr>
+        <w:pStyle w:val="Prrafodelista"/>
+        <w:numPr>
+          <w:ilvl w:val="0"/>
+          <w:numId w:val="2"/>
+        </w:numPr>
+        <w:jc w:val="both"/>
+        <w:rPr>
+          <w:b/>
+          <w:bCs/>
+        </w:rPr>
+      </w:pPr>
+      <w:r>
+        <w:rPr>
+          <w:b/>
+          <w:bCs/>
+        </w:rPr>
+        <w:t xml:space="preserve">Permisos de aplicación: </w:t>
+      </w:r>
+      <w:r>
+        <w:t>No es necesario iniciar sesión antes.</w:t>
+      </w:r>
+    </w:p>
+    <w:p>
+      <w:pPr>
+        <w:jc w:val="both"/>
+        <w:rPr>
+          <w:b/>
+          <w:bCs/>
+        </w:rPr>
+      </w:pPr>
+    </w:p>
+    <w:p>
+      <w:pPr>
+        <w:jc w:val="both"/>
+        <w:rPr>
+          <w:b/>
+          <w:bCs/>
+        </w:rPr>
+      </w:pPr>
+      <w:r>
+        <w:t>Elegiremos el permiso</w:t>
+      </w:r>
+      <w:r>
+        <w:rPr>
+          <w:b/>
+          <w:bCs/>
+        </w:rPr>
+        <w:t xml:space="preserve"> ReadWrite.</w:t>
+      </w:r>
+    </w:p>
+    <w:p>
+      <w:pPr>
+        <w:jc w:val="both"/>
+        <w:rPr>
+          <w:b/>
+          <w:bCs/>
+        </w:rPr>
+      </w:pPr>
+      <w:r>
+        <w:rPr>
+          <w:b/>
+          <w:bCs/>
+          <w:noProof/>
+        </w:rPr>
+        <w:drawing>
+          <wp:inline distT="0" distB="0" distL="0" distR="0" wp14:anchorId="2480CE96" wp14:editId="609A108C">
+            <wp:extent cx="4674239" cy="3638145"/>
+            <wp:effectExtent l="0" t="0" r="0" b="635"/>
+            <wp:docPr id="998294149" name="Imagen 16"/>
+            <wp:cNvGraphicFramePr>
+              <a:graphicFrameLocks xmlns:a="http://schemas.openxmlformats.org/drawingml/2006/main" noChangeAspect="1"/>
+            </wp:cNvGraphicFramePr>
+            <a:graphic xmlns:a="http://schemas.openxmlformats.org/drawingml/2006/main">
+              <a:graphicData uri="http://schemas.openxmlformats.org/drawingml/2006/picture">
+                <pic:pic xmlns:pic="http://schemas.openxmlformats.org/drawingml/2006/picture">
+                  <pic:nvPicPr>
+                    <pic:cNvPr id="998294149" name="Imagen 998294149"/>
+                    <pic:cNvPicPr/>
+                  </pic:nvPicPr>
+                  <pic:blipFill>
+                    <a:blip r:embed="rId19">
+                      <a:extLst>
+                        <a:ext uri="{28A0092B-C50C-407E-A947-70E740481C1C}">
+                          <a14:useLocalDpi xmlns:a14="http://schemas.microsoft.com/office/drawing/2010/main" val="0"/>
+                        </a:ext>
+                      </a:extLst>
+                    </a:blip>
+                    <a:stretch>
+                      <a:fillRect/>
+                    </a:stretch>
+                  </pic:blipFill>
+                  <pic:spPr>
+                    <a:xfrm>
+                      <a:off x="0" y="0"/>
+                      <a:ext cx="4676598" cy="3639981"/>
+                    </a:xfrm>
+                    <a:prstGeom prst="rect">
+                      <a:avLst/>
+                    </a:prstGeom>
+                  </pic:spPr>
+                </pic:pic>
+              </a:graphicData>
+            </a:graphic>
+          </wp:inline>
+        </w:drawing>
+      </w:r>
+    </w:p>
+    <w:p>
+      <w:pPr>
+        <w:jc w:val="both"/>
+      </w:pPr>
+      <w:r>
+        <w:lastRenderedPageBreak/>
+        <w:t xml:space="preserve">Una vez elegidos los permisos, </w:t>
+      </w:r>
+      <w:r>
+        <w:t>podemos comprobar que aparece la tabla de permisos ya actualizada.</w:t>
+      </w:r>
+    </w:p>
+    <w:p>
+      <w:pPr>
+        <w:jc w:val="both"/>
+      </w:pPr>
+      <w:r>
+        <w:rPr>
+          <w:noProof/>
+        </w:rPr>
+        <w:drawing>
+          <wp:inline distT="0" distB="0" distL="0" distR="0" wp14:anchorId="35C061F9" wp14:editId="7304943F">
+            <wp:extent cx="5400040" cy="1361873"/>
+            <wp:effectExtent l="0" t="0" r="0" b="0"/>
+            <wp:docPr id="1599892652" name="Imagen 18"/>
+            <wp:cNvGraphicFramePr>
+              <a:graphicFrameLocks xmlns:a="http://schemas.openxmlformats.org/drawingml/2006/main" noChangeAspect="1"/>
+            </wp:cNvGraphicFramePr>
+            <a:graphic xmlns:a="http://schemas.openxmlformats.org/drawingml/2006/main">
+              <a:graphicData uri="http://schemas.openxmlformats.org/drawingml/2006/picture">
+                <pic:pic xmlns:pic="http://schemas.openxmlformats.org/drawingml/2006/picture">
+                  <pic:nvPicPr>
+                    <pic:cNvPr id="1599892652" name="Imagen 1599892652"/>
+                    <pic:cNvPicPr/>
+                  </pic:nvPicPr>
+                  <pic:blipFill>
+                    <a:blip r:embed="rId20">
+                      <a:extLst>
+                        <a:ext uri="{28A0092B-C50C-407E-A947-70E740481C1C}">
+                          <a14:useLocalDpi xmlns:a14="http://schemas.microsoft.com/office/drawing/2010/main" val="0"/>
+                        </a:ext>
+                      </a:extLst>
+                    </a:blip>
+                    <a:stretch>
+                      <a:fillRect/>
+                    </a:stretch>
+                  </pic:blipFill>
+                  <pic:spPr>
+                    <a:xfrm>
+                      <a:off x="0" y="0"/>
+                      <a:ext cx="5426060" cy="1368435"/>
+                    </a:xfrm>
+                    <a:prstGeom prst="rect">
+                      <a:avLst/>
+                    </a:prstGeom>
+                  </pic:spPr>
+                </pic:pic>
+              </a:graphicData>
+            </a:graphic>
+          </wp:inline>
+        </w:drawing>
+      </w:r>
+    </w:p>
+    <w:p>
+      <w:pPr>
+        <w:jc w:val="both"/>
+      </w:pPr>
+      <w:r>
+        <w:rPr>
+          <w:highlight w:val="yellow"/>
+        </w:rPr>
+        <w:t xml:space="preserve">Una vez añadido el permiso, verás un botón que dice </w:t>
+      </w:r>
+      <w:r>
+        <w:rPr>
+          <w:b/>
+          <w:bCs/>
+          <w:highlight w:val="yellow"/>
+        </w:rPr>
+        <w:t>"Conceder consentimiento de administrador para [Tu Nombre]"</w:t>
+      </w:r>
+      <w:r>
+        <w:rPr>
+          <w:highlight w:val="yellow"/>
+        </w:rPr>
+        <w:t>. Tienes que pulsarlo y decir que "Sí", de lo contrario la API te dará error 403.</w:t>
+      </w:r>
+    </w:p>
+    <w:p>
+      <w:pPr>
+        <w:jc w:val="both"/>
+      </w:pPr>
+    </w:p>
+    <w:p>
+      <w:pPr>
+        <w:jc w:val="both"/>
+      </w:pPr>
+      <w:r>
+        <w:rPr>
+          <w:noProof/>
+        </w:rPr>
+        <w:drawing>
+          <wp:inline distT="0" distB="0" distL="0" distR="0" wp14:anchorId="72D8C702" wp14:editId="472BA184">
+            <wp:extent cx="5400040" cy="861695"/>
+            <wp:effectExtent l="0" t="0" r="0" b="0"/>
+            <wp:docPr id="206417014" name="Imagen 19"/>
+            <wp:cNvGraphicFramePr>
+              <a:graphicFrameLocks xmlns:a="http://schemas.openxmlformats.org/drawingml/2006/main" noChangeAspect="1"/>
+            </wp:cNvGraphicFramePr>
+            <a:graphic xmlns:a="http://schemas.openxmlformats.org/drawingml/2006/main">
+              <a:graphicData uri="http://schemas.openxmlformats.org/drawingml/2006/picture">
+                <pic:pic xmlns:pic="http://schemas.openxmlformats.org/drawingml/2006/picture">
+                  <pic:nvPicPr>
+                    <pic:cNvPr id="206417014" name="Imagen 206417014"/>
+                    <pic:cNvPicPr/>
+                  </pic:nvPicPr>
+                  <pic:blipFill>
+                    <a:blip r:embed="rId21">
+                      <a:extLst>
+                        <a:ext uri="{28A0092B-C50C-407E-A947-70E740481C1C}">
+                          <a14:useLocalDpi xmlns:a14="http://schemas.microsoft.com/office/drawing/2010/main" val="0"/>
+                        </a:ext>
+                      </a:extLst>
+                    </a:blip>
+                    <a:stretch>
+                      <a:fillRect/>
+                    </a:stretch>
+                  </pic:blipFill>
+                  <pic:spPr>
+                    <a:xfrm>
+                      <a:off x="0" y="0"/>
+                      <a:ext cx="5400040" cy="861695"/>
+                    </a:xfrm>
+                    <a:prstGeom prst="rect">
+                      <a:avLst/>
+                    </a:prstGeom>
+                  </pic:spPr>
+                </pic:pic>
+              </a:graphicData>
+            </a:graphic>
+          </wp:inline>
+        </w:drawing>
+      </w:r>
+    </w:p>
+    <w:p>
+      <w:pPr>
+        <w:jc w:val="both"/>
+      </w:pPr>
+    </w:p>
+    <w:p>
+      <w:pPr>
+        <w:pStyle w:val="Ttulo2"/>
+      </w:pPr>
+      <w:bookmarkStart w:id="3" w:name="_Toc224294639"/>
+      <w:r>
+        <w:t>Instalación de dependencias</w:t>
+      </w:r>
+      <w:bookmarkEnd w:id="3"/>
+    </w:p>
+    <w:p>
+      <w:r>
+        <w:t>Como hemos realizado la aplicación web con PHP , debemos instalar las librerías de Microsoft con composer.</w:t>
+      </w:r>
+    </w:p>
+    <w:p>
+      <w:pPr>
+        <w:rPr>
+          <w:b/>
+          <w:bCs/>
+        </w:rPr>
+      </w:pPr>
+      <w:r>
+        <w:rPr>
+          <w:b/>
+          <w:bCs/>
+        </w:rPr>
+        <w:t>“</w:t>
+      </w:r>
+      <w:r>
+        <w:rPr>
+          <w:b/>
+          <w:bCs/>
+        </w:rPr>
+        <w:t>composer require microsoft/microsoft-graph</w:t>
+      </w:r>
+      <w:r>
+        <w:rPr>
+          <w:b/>
+          <w:bCs/>
+        </w:rPr>
+        <w:t>”</w:t>
+      </w:r>
+    </w:p>
+    <w:p>
+      <w:r>
+        <w:t>Uitlizaremos el siguiente comando, a partir de aquí debemos de realizar la codificación de nuestra aplicación Modelo – Vista – Controlador.</w:t>
+      </w:r>
     </w:p>
     <w:sectPr>
-      <w:headerReference w:type="default" r:id="rId9"/>
-      <w:footerReference w:type="default" r:id="rId10"/>
+      <w:headerReference w:type="default" r:id="rId22"/>
+      <w:footerReference w:type="default" r:id="rId23"/>
       <w:pgSz w:w="11906" w:h="16838"/>
       <w:pgMar w:top="1417" w:right="1701" w:bottom="1417" w:left="1701" w:header="708" w:footer="708" w:gutter="0"/>
       <w:pgNumType w:start="0"/>
@@ -1366,9 +2791,9 @@
 <file path=word/numbering.xml><?xml version="1.0" encoding="utf-8"?>
 <w:numbering xmlns:wpc="http://schemas.microsoft.com/office/word/2010/wordprocessingCanvas" xmlns:cx="http://schemas.microsoft.com/office/drawing/2014/chartex" xmlns:cx1="http://schemas.microsoft.com/office/drawing/2015/9/8/chartex" xmlns:cx2="http://schemas.microsoft.com/office/drawing/2015/10/21/chartex" xmlns:cx3="http://schemas.microsoft.com/office/drawing/2016/5/9/chartex" xmlns:cx4="http://schemas.microsoft.com/office/drawing/2016/5/10/chartex" xmlns:cx5="http://schemas.microsoft.com/office/drawing/2016/5/11/chartex" xmlns:cx6="http://schemas.microsoft.com/office/drawing/2016/5/12/chartex" xmlns:cx7="http://schemas.microsoft.com/office/drawing/2016/5/13/chartex" xmlns:cx8="http://schemas.microsoft.com/office/drawing/2016/5/14/chartex" xmlns:mc="http://schemas.openxmlformats.org/markup-compatibility/2006" xmlns:aink="http://schemas.microsoft.com/office/drawing/2016/ink" xmlns:am3d="http://schemas.microsoft.com/office/drawing/2017/model3d" xmlns:o="urn:schemas-microsoft-com:office:office" xmlns:oel="http://schemas.microsoft.com/office/2019/extlst" xmlns:r="http://schemas.openxmlformats.org/officeDocument/2006/relationships" xmlns:m="http://schemas.openxmlformats.org/officeDocument/2006/math" xmlns:v="urn:schemas-microsoft-com:vml" xmlns:wp14="http://schemas.microsoft.com/office/word/2010/wordprocessingDrawing" xmlns:wp="http://schemas.openxmlformats.org/drawingml/2006/wordprocessingDrawing" xmlns:w10="urn:schemas-microsoft-com:office:word" xmlns:w="http://schemas.openxmlformats.org/wordprocessingml/2006/main" xmlns:w14="http://schemas.microsoft.com/office/word/2010/wordml" xmlns:w15="http://schemas.microsoft.com/office/word/2012/wordml" xmlns:w16cex="http://schemas.microsoft.com/office/word/2018/wordml/cex" xmlns:w16cid="http://schemas.microsoft.com/office/word/2016/wordml/cid" xmlns:w16="http://schemas.microsoft.com/office/word/2018/wordml" xmlns:w16du="http://schemas.microsoft.com/office/word/2023/wordml/word16du" xmlns:w16sdtdh="http://schemas.microsoft.com/office/word/2020/wordml/sdtdatahash" xmlns:w16sdtfl="http://schemas.microsoft.com/office/word/2024/wordml/sdtformatlock" xmlns:w16se="http://schemas.microsoft.com/office/word/2015/wordml/symex" xmlns:wpg="http://schemas.microsoft.com/office/word/2010/wordprocessingGroup" xmlns:wpi="http://schemas.microsoft.com/office/word/2010/wordprocessingInk" xmlns:wne="http://schemas.microsoft.com/office/word/2006/wordml" xmlns:wps="http://schemas.microsoft.com/office/word/2010/wordprocessingShape" mc:Ignorable="w14 w15 w16se w16cid w16 w16cex w16sdtdh w16sdtfl w16du wp14">
   <w:abstractNum w:abstractNumId="0" w15:restartNumberingAfterBreak="0">
-    <w:nsid w:val="33336FFB"/>
+    <w:nsid w:val="006547B3"/>
     <w:multiLevelType w:val="hybridMultilevel"/>
-    <w:tmpl w:val="640486D2"/>
+    <w:tmpl w:val="E146C12A"/>
     <w:lvl w:ilvl="0" w:tplc="0C0A0001">
       <w:start w:val="1"/>
       <w:numFmt w:val="bullet"/>
@@ -1478,7 +2903,123 @@
       </w:rPr>
     </w:lvl>
   </w:abstractNum>
+  <w:abstractNum w:abstractNumId="1" w15:restartNumberingAfterBreak="0">
+    <w:nsid w:val="33336FFB"/>
+    <w:multiLevelType w:val="hybridMultilevel"/>
+    <w:tmpl w:val="640486D2"/>
+    <w:lvl w:ilvl="0" w:tplc="0C0A0001">
+      <w:start w:val="1"/>
+      <w:numFmt w:val="bullet"/>
+      <w:lvlText w:val=""/>
+      <w:lvlJc w:val="left"/>
+      <w:pPr>
+        <w:ind w:left="720" w:hanging="360"/>
+      </w:pPr>
+      <w:rPr>
+        <w:rFonts w:ascii="Symbol" w:hAnsi="Symbol" w:hint="default"/>
+      </w:rPr>
+    </w:lvl>
+    <w:lvl w:ilvl="1" w:tplc="0C0A0003" w:tentative="1">
+      <w:start w:val="1"/>
+      <w:numFmt w:val="bullet"/>
+      <w:lvlText w:val="o"/>
+      <w:lvlJc w:val="left"/>
+      <w:pPr>
+        <w:ind w:left="1440" w:hanging="360"/>
+      </w:pPr>
+      <w:rPr>
+        <w:rFonts w:ascii="Courier New" w:hAnsi="Courier New" w:cs="Courier New" w:hint="default"/>
+      </w:rPr>
+    </w:lvl>
+    <w:lvl w:ilvl="2" w:tplc="0C0A0005" w:tentative="1">
+      <w:start w:val="1"/>
+      <w:numFmt w:val="bullet"/>
+      <w:lvlText w:val=""/>
+      <w:lvlJc w:val="left"/>
+      <w:pPr>
+        <w:ind w:left="2160" w:hanging="360"/>
+      </w:pPr>
+      <w:rPr>
+        <w:rFonts w:ascii="Wingdings" w:hAnsi="Wingdings" w:hint="default"/>
+      </w:rPr>
+    </w:lvl>
+    <w:lvl w:ilvl="3" w:tplc="0C0A0001" w:tentative="1">
+      <w:start w:val="1"/>
+      <w:numFmt w:val="bullet"/>
+      <w:lvlText w:val=""/>
+      <w:lvlJc w:val="left"/>
+      <w:pPr>
+        <w:ind w:left="2880" w:hanging="360"/>
+      </w:pPr>
+      <w:rPr>
+        <w:rFonts w:ascii="Symbol" w:hAnsi="Symbol" w:hint="default"/>
+      </w:rPr>
+    </w:lvl>
+    <w:lvl w:ilvl="4" w:tplc="0C0A0003" w:tentative="1">
+      <w:start w:val="1"/>
+      <w:numFmt w:val="bullet"/>
+      <w:lvlText w:val="o"/>
+      <w:lvlJc w:val="left"/>
+      <w:pPr>
+        <w:ind w:left="3600" w:hanging="360"/>
+      </w:pPr>
+      <w:rPr>
+        <w:rFonts w:ascii="Courier New" w:hAnsi="Courier New" w:cs="Courier New" w:hint="default"/>
+      </w:rPr>
+    </w:lvl>
+    <w:lvl w:ilvl="5" w:tplc="0C0A0005" w:tentative="1">
+      <w:start w:val="1"/>
+      <w:numFmt w:val="bullet"/>
+      <w:lvlText w:val=""/>
+      <w:lvlJc w:val="left"/>
+      <w:pPr>
+        <w:ind w:left="4320" w:hanging="360"/>
+      </w:pPr>
+      <w:rPr>
+        <w:rFonts w:ascii="Wingdings" w:hAnsi="Wingdings" w:hint="default"/>
+      </w:rPr>
+    </w:lvl>
+    <w:lvl w:ilvl="6" w:tplc="0C0A0001" w:tentative="1">
+      <w:start w:val="1"/>
+      <w:numFmt w:val="bullet"/>
+      <w:lvlText w:val=""/>
+      <w:lvlJc w:val="left"/>
+      <w:pPr>
+        <w:ind w:left="5040" w:hanging="360"/>
+      </w:pPr>
+      <w:rPr>
+        <w:rFonts w:ascii="Symbol" w:hAnsi="Symbol" w:hint="default"/>
+      </w:rPr>
+    </w:lvl>
+    <w:lvl w:ilvl="7" w:tplc="0C0A0003" w:tentative="1">
+      <w:start w:val="1"/>
+      <w:numFmt w:val="bullet"/>
+      <w:lvlText w:val="o"/>
+      <w:lvlJc w:val="left"/>
+      <w:pPr>
+        <w:ind w:left="5760" w:hanging="360"/>
+      </w:pPr>
+      <w:rPr>
+        <w:rFonts w:ascii="Courier New" w:hAnsi="Courier New" w:cs="Courier New" w:hint="default"/>
+      </w:rPr>
+    </w:lvl>
+    <w:lvl w:ilvl="8" w:tplc="0C0A0005" w:tentative="1">
+      <w:start w:val="1"/>
+      <w:numFmt w:val="bullet"/>
+      <w:lvlText w:val=""/>
+      <w:lvlJc w:val="left"/>
+      <w:pPr>
+        <w:ind w:left="6480" w:hanging="360"/>
+      </w:pPr>
+      <w:rPr>
+        <w:rFonts w:ascii="Wingdings" w:hAnsi="Wingdings" w:hint="default"/>
+      </w:rPr>
+    </w:lvl>
+  </w:abstractNum>
   <w:num w:numId="1" w16cid:durableId="460347512">
+    <w:abstractNumId w:val="1"/>
+  </w:num>
+  <w:num w:numId="2" w16cid:durableId="323314290">
     <w:abstractNumId w:val="0"/>
   </w:num>
 </w:numbering>
@@ -2498,6 +4039,39 @@
       <w:shd w:val="clear" w:color="auto" w:fill="E1DFDD"/>
     </w:rPr>
   </w:style>
+  <w:style w:type="paragraph" w:styleId="TtuloTDC">
+    <w:name w:val="TOC Heading"/>
+    <w:basedOn w:val="Ttulo1"/>
+    <w:next w:val="Normal"/>
+    <w:uiPriority w:val="39"/>
+    <w:unhideWhenUsed/>
+    <w:qFormat/>
+    <w:rsid w:val="00BA4CA6"/>
+    <w:pPr>
+      <w:spacing w:before="240" w:after="0" w:line="259" w:lineRule="auto"/>
+      <w:outlineLvl w:val="9"/>
+    </w:pPr>
+    <w:rPr>
+      <w:kern w:val="0"/>
+      <w:sz w:val="32"/>
+      <w:szCs w:val="32"/>
+      <w:lang w:eastAsia="es-ES"/>
+      <w14:ligatures w14:val="none"/>
+    </w:rPr>
+  </w:style>
+  <w:style w:type="paragraph" w:styleId="TDC2">
+    <w:name w:val="toc 2"/>
+    <w:basedOn w:val="Normal"/>
+    <w:next w:val="Normal"/>
+    <w:autoRedefine/>
+    <w:uiPriority w:val="39"/>
+    <w:unhideWhenUsed/>
+    <w:rsid w:val="00BA4CA6"/>
+    <w:pPr>
+      <w:spacing w:after="100"/>
+      <w:ind w:left="240"/>
+    </w:pPr>
+  </w:style>
 </w:styles>
 </file>
 
@@ -2600,8 +4174,11 @@
   <w:rsids>
     <w:rsidRoot w:val="00BF0638"/>
     <w:rsid w:val="00250C01"/>
+    <w:rsid w:val="003B3F98"/>
+    <w:rsid w:val="00504BA5"/>
     <w:rsid w:val="00B025B5"/>
     <w:rsid w:val="00BF0638"/>
+    <w:rsid w:val="00F653D7"/>
   </w:rsids>
   <m:mathPr>
     <m:mathFont m:val="Cambria Math"/>
@@ -3389,4 +4966,16 @@
     </a:ext>
   </a:extLst>
 </a:theme>
+</file>
+
+<file path=customXml/item1.xml><?xml version="1.0" encoding="utf-8"?>
+<b:Sources xmlns:b="http://schemas.openxmlformats.org/officeDocument/2006/bibliography" xmlns="http://schemas.openxmlformats.org/officeDocument/2006/bibliography" SelectedStyle="\APASixthEditionOfficeOnline.xsl" StyleName="APA" Version="6"/>
+</file>
+
+<file path=customXml/itemProps1.xml><?xml version="1.0" encoding="utf-8"?>
+<ds:datastoreItem xmlns:ds="http://schemas.openxmlformats.org/officeDocument/2006/customXml" ds:itemID="{F901EED3-CA1D-478C-B9BE-A99F3CCA8EB5}">
+  <ds:schemaRefs>
+    <ds:schemaRef ds:uri="http://schemas.openxmlformats.org/officeDocument/2006/bibliography"/>
+  </ds:schemaRefs>
+</ds:datastoreItem>
 </file>
</xml_diff>

<commit_message>
ADD : DOC Y PDF
</commit_message>
<xml_diff>
--- a/webroot/doc/Documentos/Doc Microsoft API Calendar.docx
+++ b/webroot/doc/Documentos/Doc Microsoft API Calendar.docx
@@ -146,21 +146,7 @@
                                         <w:rPr>
                                           <w:color w:val="FFFFFF" w:themeColor="background1"/>
                                         </w:rPr>
-                                        <w:t xml:space="preserve">Alejandro De la </w:t>
-                                      </w:r>
-                                      <w:proofErr w:type="spellStart"/>
-                                      <w:r>
-                                        <w:rPr>
-                                          <w:color w:val="FFFFFF" w:themeColor="background1"/>
-                                        </w:rPr>
-                                        <w:t>Huerga</w:t>
-                                      </w:r>
-                                      <w:proofErr w:type="spellEnd"/>
-                                      <w:r>
-                                        <w:rPr>
-                                          <w:color w:val="FFFFFF" w:themeColor="background1"/>
-                                        </w:rPr>
-                                        <w:t xml:space="preserve"> – Álvaro García</w:t>
+                                        <w:t>Alejandro De la Huerga – Álvaro García</w:t>
                                       </w:r>
                                     </w:p>
                                   </w:sdtContent>
@@ -362,21 +348,7 @@
                                   <w:rPr>
                                     <w:color w:val="FFFFFF" w:themeColor="background1"/>
                                   </w:rPr>
-                                  <w:t xml:space="preserve">Alejandro De la </w:t>
-                                </w:r>
-                                <w:proofErr w:type="spellStart"/>
-                                <w:r>
-                                  <w:rPr>
-                                    <w:color w:val="FFFFFF" w:themeColor="background1"/>
-                                  </w:rPr>
-                                  <w:t>Huerga</w:t>
-                                </w:r>
-                                <w:proofErr w:type="spellEnd"/>
-                                <w:r>
-                                  <w:rPr>
-                                    <w:color w:val="FFFFFF" w:themeColor="background1"/>
-                                  </w:rPr>
-                                  <w:t xml:space="preserve"> – Álvaro García</w:t>
+                                  <w:t>Alejandro De la Huerga – Álvaro García</w:t>
                                 </w:r>
                               </w:p>
                             </w:sdtContent>
@@ -508,6 +480,336 @@
         </w:p>
       </w:sdtContent>
     </w:sdt>
+    <w:sdt>
+      <w:sdtPr>
+        <w:id w:val="-1209492155"/>
+        <w:docPartObj>
+          <w:docPartGallery w:val="Table of Contents"/>
+          <w:docPartUnique/>
+        </w:docPartObj>
+      </w:sdtPr>
+      <w:sdtEndPr>
+        <w:rPr>
+          <w:rFonts w:asciiTheme="minorHAnsi" w:eastAsiaTheme="minorHAnsi" w:hAnsiTheme="minorHAnsi" w:cstheme="minorBidi"/>
+          <w:b/>
+          <w:bCs/>
+          <w:color w:val="auto"/>
+          <w:kern w:val="2"/>
+          <w:sz w:val="24"/>
+          <w:szCs w:val="24"/>
+          <w:lang w:eastAsia="en-US"/>
+          <w14:ligatures w14:val="standardContextual"/>
+        </w:rPr>
+      </w:sdtEndPr>
+      <w:sdtContent>
+        <w:p>
+          <w:pPr>
+            <w:pStyle w:val="TtuloTDC"/>
+          </w:pPr>
+          <w:r>
+            <w:t>Contenido</w:t>
+          </w:r>
+        </w:p>
+        <w:p>
+          <w:pPr>
+            <w:pStyle w:val="TDC2"/>
+            <w:tabs>
+              <w:tab w:val="right" w:leader="dot" w:pos="8494"/>
+            </w:tabs>
+            <w:rPr>
+              <w:rFonts w:eastAsiaTheme="minorEastAsia"/>
+              <w:noProof/>
+              <w:lang w:eastAsia="es-ES"/>
+            </w:rPr>
+          </w:pPr>
+          <w:r>
+            <w:fldChar w:fldCharType="begin"/>
+          </w:r>
+          <w:r>
+            <w:instrText xml:space="preserve"> TOC \o "1-3" \h \z \u </w:instrText>
+          </w:r>
+          <w:r>
+            <w:fldChar w:fldCharType="separate"/>
+          </w:r>
+          <w:hyperlink w:anchor="_Toc224294636" w:history="1">
+            <w:r>
+              <w:rPr>
+                <w:rStyle w:val="Hipervnculo"/>
+                <w:noProof/>
+              </w:rPr>
+              <w:t>Introducción</w:t>
+            </w:r>
+            <w:r>
+              <w:rPr>
+                <w:noProof/>
+                <w:webHidden/>
+              </w:rPr>
+              <w:tab/>
+            </w:r>
+            <w:r>
+              <w:rPr>
+                <w:noProof/>
+                <w:webHidden/>
+              </w:rPr>
+              <w:fldChar w:fldCharType="begin"/>
+            </w:r>
+            <w:r>
+              <w:rPr>
+                <w:noProof/>
+                <w:webHidden/>
+              </w:rPr>
+              <w:instrText xml:space="preserve"> PAGEREF _Toc224294636 \h </w:instrText>
+            </w:r>
+            <w:r>
+              <w:rPr>
+                <w:noProof/>
+                <w:webHidden/>
+              </w:rPr>
+            </w:r>
+            <w:r>
+              <w:rPr>
+                <w:noProof/>
+                <w:webHidden/>
+              </w:rPr>
+              <w:fldChar w:fldCharType="separate"/>
+            </w:r>
+            <w:r>
+              <w:rPr>
+                <w:noProof/>
+                <w:webHidden/>
+              </w:rPr>
+              <w:t>2</w:t>
+            </w:r>
+            <w:r>
+              <w:rPr>
+                <w:noProof/>
+                <w:webHidden/>
+              </w:rPr>
+              <w:fldChar w:fldCharType="end"/>
+            </w:r>
+          </w:hyperlink>
+        </w:p>
+        <w:p>
+          <w:pPr>
+            <w:pStyle w:val="TDC2"/>
+            <w:tabs>
+              <w:tab w:val="right" w:leader="dot" w:pos="8494"/>
+            </w:tabs>
+            <w:rPr>
+              <w:rFonts w:eastAsiaTheme="minorEastAsia"/>
+              <w:noProof/>
+              <w:lang w:eastAsia="es-ES"/>
+            </w:rPr>
+          </w:pPr>
+          <w:hyperlink w:anchor="_Toc224294637" w:history="1">
+            <w:r>
+              <w:rPr>
+                <w:rStyle w:val="Hipervnculo"/>
+                <w:noProof/>
+              </w:rPr>
+              <w:t>Requisitos mínimos</w:t>
+            </w:r>
+            <w:r>
+              <w:rPr>
+                <w:noProof/>
+                <w:webHidden/>
+              </w:rPr>
+              <w:tab/>
+            </w:r>
+            <w:r>
+              <w:rPr>
+                <w:noProof/>
+                <w:webHidden/>
+              </w:rPr>
+              <w:fldChar w:fldCharType="begin"/>
+            </w:r>
+            <w:r>
+              <w:rPr>
+                <w:noProof/>
+                <w:webHidden/>
+              </w:rPr>
+              <w:instrText xml:space="preserve"> PAGEREF _Toc224294637 \h </w:instrText>
+            </w:r>
+            <w:r>
+              <w:rPr>
+                <w:noProof/>
+                <w:webHidden/>
+              </w:rPr>
+            </w:r>
+            <w:r>
+              <w:rPr>
+                <w:noProof/>
+                <w:webHidden/>
+              </w:rPr>
+              <w:fldChar w:fldCharType="separate"/>
+            </w:r>
+            <w:r>
+              <w:rPr>
+                <w:noProof/>
+                <w:webHidden/>
+              </w:rPr>
+              <w:t>2</w:t>
+            </w:r>
+            <w:r>
+              <w:rPr>
+                <w:noProof/>
+                <w:webHidden/>
+              </w:rPr>
+              <w:fldChar w:fldCharType="end"/>
+            </w:r>
+          </w:hyperlink>
+        </w:p>
+        <w:p>
+          <w:pPr>
+            <w:pStyle w:val="TDC2"/>
+            <w:tabs>
+              <w:tab w:val="right" w:leader="dot" w:pos="8494"/>
+            </w:tabs>
+            <w:rPr>
+              <w:rFonts w:eastAsiaTheme="minorEastAsia"/>
+              <w:noProof/>
+              <w:lang w:eastAsia="es-ES"/>
+            </w:rPr>
+          </w:pPr>
+          <w:hyperlink w:anchor="_Toc224294638" w:history="1">
+            <w:r>
+              <w:rPr>
+                <w:rStyle w:val="Hipervnculo"/>
+                <w:noProof/>
+              </w:rPr>
+              <w:t>Portal Microsoft Azure</w:t>
+            </w:r>
+            <w:r>
+              <w:rPr>
+                <w:noProof/>
+                <w:webHidden/>
+              </w:rPr>
+              <w:tab/>
+            </w:r>
+            <w:r>
+              <w:rPr>
+                <w:noProof/>
+                <w:webHidden/>
+              </w:rPr>
+              <w:fldChar w:fldCharType="begin"/>
+            </w:r>
+            <w:r>
+              <w:rPr>
+                <w:noProof/>
+                <w:webHidden/>
+              </w:rPr>
+              <w:instrText xml:space="preserve"> PAGEREF _Toc224294638 \h </w:instrText>
+            </w:r>
+            <w:r>
+              <w:rPr>
+                <w:noProof/>
+                <w:webHidden/>
+              </w:rPr>
+            </w:r>
+            <w:r>
+              <w:rPr>
+                <w:noProof/>
+                <w:webHidden/>
+              </w:rPr>
+              <w:fldChar w:fldCharType="separate"/>
+            </w:r>
+            <w:r>
+              <w:rPr>
+                <w:noProof/>
+                <w:webHidden/>
+              </w:rPr>
+              <w:t>3</w:t>
+            </w:r>
+            <w:r>
+              <w:rPr>
+                <w:noProof/>
+                <w:webHidden/>
+              </w:rPr>
+              <w:fldChar w:fldCharType="end"/>
+            </w:r>
+          </w:hyperlink>
+        </w:p>
+        <w:p>
+          <w:pPr>
+            <w:pStyle w:val="TDC2"/>
+            <w:tabs>
+              <w:tab w:val="right" w:leader="dot" w:pos="8494"/>
+            </w:tabs>
+            <w:rPr>
+              <w:rFonts w:eastAsiaTheme="minorEastAsia"/>
+              <w:noProof/>
+              <w:lang w:eastAsia="es-ES"/>
+            </w:rPr>
+          </w:pPr>
+          <w:hyperlink w:anchor="_Toc224294639" w:history="1">
+            <w:r>
+              <w:rPr>
+                <w:rStyle w:val="Hipervnculo"/>
+                <w:noProof/>
+              </w:rPr>
+              <w:t>Instalación de dependencias</w:t>
+            </w:r>
+            <w:r>
+              <w:rPr>
+                <w:noProof/>
+                <w:webHidden/>
+              </w:rPr>
+              <w:tab/>
+            </w:r>
+            <w:r>
+              <w:rPr>
+                <w:noProof/>
+                <w:webHidden/>
+              </w:rPr>
+              <w:fldChar w:fldCharType="begin"/>
+            </w:r>
+            <w:r>
+              <w:rPr>
+                <w:noProof/>
+                <w:webHidden/>
+              </w:rPr>
+              <w:instrText xml:space="preserve"> PAGEREF _Toc224294639 \h </w:instrText>
+            </w:r>
+            <w:r>
+              <w:rPr>
+                <w:noProof/>
+                <w:webHidden/>
+              </w:rPr>
+            </w:r>
+            <w:r>
+              <w:rPr>
+                <w:noProof/>
+                <w:webHidden/>
+              </w:rPr>
+              <w:fldChar w:fldCharType="separate"/>
+            </w:r>
+            <w:r>
+              <w:rPr>
+                <w:noProof/>
+                <w:webHidden/>
+              </w:rPr>
+              <w:t>8</w:t>
+            </w:r>
+            <w:r>
+              <w:rPr>
+                <w:noProof/>
+                <w:webHidden/>
+              </w:rPr>
+              <w:fldChar w:fldCharType="end"/>
+            </w:r>
+          </w:hyperlink>
+        </w:p>
+        <w:p>
+          <w:r>
+            <w:rPr>
+              <w:b/>
+              <w:bCs/>
+            </w:rPr>
+            <w:fldChar w:fldCharType="end"/>
+          </w:r>
+        </w:p>
+      </w:sdtContent>
+    </w:sdt>
     <w:p/>
     <w:p/>
     <w:p/>
@@ -530,20 +832,17 @@
     <w:p/>
     <w:p/>
     <w:p/>
-    <w:p/>
-    <w:p/>
-    <w:p/>
-    <w:p/>
-    <w:p/>
     <w:p>
       <w:pPr>
         <w:pStyle w:val="Ttulo2"/>
         <w:jc w:val="both"/>
       </w:pPr>
+      <w:bookmarkStart w:id="0" w:name="_Toc224294636"/>
       <w:r>
         <w:lastRenderedPageBreak/>
         <w:t>Introducción</w:t>
       </w:r>
+      <w:bookmarkEnd w:id="0"/>
     </w:p>
     <w:p>
       <w:pPr>
@@ -646,7 +945,7 @@
         </w:rPr>
         <w:t xml:space="preserve">Documentación oficial: </w:t>
       </w:r>
-      <w:hyperlink r:id="rId7" w:history="1">
+      <w:hyperlink r:id="rId8" w:history="1">
         <w:r>
           <w:rPr>
             <w:rStyle w:val="Hipervnculo"/>
@@ -721,9 +1020,11 @@
         <w:pStyle w:val="Ttulo2"/>
         <w:jc w:val="both"/>
       </w:pPr>
+      <w:bookmarkStart w:id="1" w:name="_Toc224294637"/>
       <w:r>
         <w:t>Requisitos mínimos</w:t>
       </w:r>
+      <w:bookmarkEnd w:id="1"/>
     </w:p>
     <w:p>
       <w:pPr>
@@ -764,17 +1065,7 @@
         <w:t xml:space="preserve">: </w:t>
       </w:r>
       <w:r>
-        <w:t>Cualquier cuenta de dominio Microsoft es válida para realizar la integración (</w:t>
-      </w:r>
-      <w:proofErr w:type="spellStart"/>
-      <w:proofErr w:type="gramStart"/>
-      <w:r>
-        <w:t>Hotmail,Outlook</w:t>
-      </w:r>
-      <w:proofErr w:type="spellEnd"/>
-      <w:proofErr w:type="gramEnd"/>
-      <w:r>
-        <w:t>…).</w:t>
+        <w:t>Cualquier cuenta de dominio Microsoft es válida para realizar la integración (Hotmail,Outlook…).</w:t>
       </w:r>
     </w:p>
     <w:p>
@@ -790,7 +1081,7 @@
           <w:bCs/>
         </w:rPr>
       </w:pPr>
-      <w:hyperlink r:id="rId8" w:history="1">
+      <w:hyperlink r:id="rId9" w:history="1">
         <w:r>
           <w:rPr>
             <w:rStyle w:val="Hipervnculo"/>
@@ -899,24 +1190,10 @@
     </w:p>
     <w:p>
       <w:pPr>
-        <w:rPr>
-          <w:b/>
-          <w:bCs/>
-        </w:rPr>
-      </w:pPr>
-    </w:p>
-    <w:p>
-      <w:pPr>
-        <w:rPr>
-          <w:b/>
-          <w:bCs/>
-        </w:rPr>
-      </w:pPr>
-    </w:p>
-    <w:p>
-      <w:pPr>
         <w:pStyle w:val="Ttulo2"/>
-      </w:pPr>
+        <w:jc w:val="both"/>
+      </w:pPr>
+      <w:bookmarkStart w:id="2" w:name="_Toc224294638"/>
     </w:p>
     <w:p>
       <w:pPr>
@@ -926,6 +1203,7 @@
       <w:r>
         <w:t>Portal Microsoft Azure</w:t>
       </w:r>
+      <w:bookmarkEnd w:id="2"/>
     </w:p>
     <w:p>
       <w:pPr>
@@ -939,10 +1217,1157 @@
       <w:pPr>
         <w:jc w:val="both"/>
       </w:pPr>
+      <w:r>
+        <w:t xml:space="preserve">Una vez iniciado sesión debemos dirigirnos al </w:t>
+      </w:r>
+      <w:hyperlink r:id="rId10" w:tgtFrame="_blank" w:history="1">
+        <w:r>
+          <w:rPr>
+            <w:rStyle w:val="Hipervnculo"/>
+          </w:rPr>
+          <w:t>Centro de administración de Microsoft Entra (Azure AD)</w:t>
+        </w:r>
+      </w:hyperlink>
+      <w:r>
+        <w:t>.</w:t>
+      </w:r>
+    </w:p>
+    <w:p>
+      <w:pPr>
+        <w:jc w:val="both"/>
+      </w:pPr>
+      <w:r>
+        <w:t xml:space="preserve">El siguiente paso será dirigirnos al apartado que dice </w:t>
+      </w:r>
+      <w:r>
+        <w:rPr>
+          <w:b/>
+          <w:bCs/>
+        </w:rPr>
+        <w:t xml:space="preserve">“Todos los servicios” </w:t>
+      </w:r>
+      <w:r>
+        <w:t>, suele encontrase en el menú lateral izquierdo.</w:t>
+      </w:r>
+    </w:p>
+    <w:p>
+      <w:pPr>
+        <w:jc w:val="both"/>
+        <w:rPr>
+          <w:b/>
+          <w:bCs/>
+        </w:rPr>
+      </w:pPr>
+      <w:r>
+        <w:t xml:space="preserve">Una vez allí en el buscador, buscaremos el servicio llamado </w:t>
+      </w:r>
+      <w:r>
+        <w:rPr>
+          <w:b/>
+          <w:bCs/>
+        </w:rPr>
+        <w:t>“Registro de aplicaciones”</w:t>
+      </w:r>
+      <w:r>
+        <w:rPr>
+          <w:b/>
+          <w:bCs/>
+        </w:rPr>
+        <w:t>.</w:t>
+      </w:r>
+    </w:p>
+    <w:p>
+      <w:pPr>
+        <w:jc w:val="both"/>
+      </w:pPr>
+    </w:p>
+    <w:p>
+      <w:pPr>
+        <w:jc w:val="both"/>
+      </w:pPr>
+      <w:r>
+        <w:rPr>
+          <w:noProof/>
+        </w:rPr>
+        <w:drawing>
+          <wp:inline distT="0" distB="0" distL="0" distR="0" wp14:anchorId="3349F162" wp14:editId="3A5BC279">
+            <wp:extent cx="5400040" cy="1739900"/>
+            <wp:effectExtent l="0" t="0" r="0" b="0"/>
+            <wp:docPr id="1291293541" name="Imagen 5"/>
+            <wp:cNvGraphicFramePr>
+              <a:graphicFrameLocks xmlns:a="http://schemas.openxmlformats.org/drawingml/2006/main" noChangeAspect="1"/>
+            </wp:cNvGraphicFramePr>
+            <a:graphic xmlns:a="http://schemas.openxmlformats.org/drawingml/2006/main">
+              <a:graphicData uri="http://schemas.openxmlformats.org/drawingml/2006/picture">
+                <pic:pic xmlns:pic="http://schemas.openxmlformats.org/drawingml/2006/picture">
+                  <pic:nvPicPr>
+                    <pic:cNvPr id="1291293541" name="Imagen 1291293541"/>
+                    <pic:cNvPicPr/>
+                  </pic:nvPicPr>
+                  <pic:blipFill>
+                    <a:blip r:embed="rId11">
+                      <a:extLst>
+                        <a:ext uri="{28A0092B-C50C-407E-A947-70E740481C1C}">
+                          <a14:useLocalDpi xmlns:a14="http://schemas.microsoft.com/office/drawing/2010/main" val="0"/>
+                        </a:ext>
+                      </a:extLst>
+                    </a:blip>
+                    <a:stretch>
+                      <a:fillRect/>
+                    </a:stretch>
+                  </pic:blipFill>
+                  <pic:spPr>
+                    <a:xfrm>
+                      <a:off x="0" y="0"/>
+                      <a:ext cx="5400040" cy="1739900"/>
+                    </a:xfrm>
+                    <a:prstGeom prst="rect">
+                      <a:avLst/>
+                    </a:prstGeom>
+                  </pic:spPr>
+                </pic:pic>
+              </a:graphicData>
+            </a:graphic>
+          </wp:inline>
+        </w:drawing>
+      </w:r>
+    </w:p>
+    <w:p>
+      <w:pPr>
+        <w:jc w:val="both"/>
+        <w:rPr>
+          <w:b/>
+          <w:bCs/>
+        </w:rPr>
+      </w:pPr>
+      <w:r>
+        <w:t xml:space="preserve">Una vez accedamos al servicio citado anteriormente, nos dirigiremos a la sección que dice </w:t>
+      </w:r>
+      <w:r>
+        <w:rPr>
+          <w:b/>
+          <w:bCs/>
+        </w:rPr>
+        <w:t>“Nuevo Registro”</w:t>
+      </w:r>
+      <w:r>
+        <w:rPr>
+          <w:b/>
+          <w:bCs/>
+        </w:rPr>
+        <w:t>.</w:t>
+      </w:r>
+    </w:p>
+    <w:p>
+      <w:pPr>
+        <w:jc w:val="both"/>
+        <w:rPr>
+          <w:b/>
+          <w:bCs/>
+        </w:rPr>
+      </w:pPr>
+    </w:p>
+    <w:p>
+      <w:pPr>
+        <w:jc w:val="both"/>
+      </w:pPr>
+      <w:r>
+        <w:rPr>
+          <w:noProof/>
+        </w:rPr>
+        <w:drawing>
+          <wp:inline distT="0" distB="0" distL="0" distR="0" wp14:anchorId="3465F553" wp14:editId="6DABAC25">
+            <wp:extent cx="5400040" cy="1888490"/>
+            <wp:effectExtent l="0" t="0" r="0" b="0"/>
+            <wp:docPr id="1578803757" name="Imagen 6"/>
+            <wp:cNvGraphicFramePr>
+              <a:graphicFrameLocks xmlns:a="http://schemas.openxmlformats.org/drawingml/2006/main" noChangeAspect="1"/>
+            </wp:cNvGraphicFramePr>
+            <a:graphic xmlns:a="http://schemas.openxmlformats.org/drawingml/2006/main">
+              <a:graphicData uri="http://schemas.openxmlformats.org/drawingml/2006/picture">
+                <pic:pic xmlns:pic="http://schemas.openxmlformats.org/drawingml/2006/picture">
+                  <pic:nvPicPr>
+                    <pic:cNvPr id="1578803757" name="Imagen 1578803757"/>
+                    <pic:cNvPicPr/>
+                  </pic:nvPicPr>
+                  <pic:blipFill>
+                    <a:blip r:embed="rId12">
+                      <a:extLst>
+                        <a:ext uri="{28A0092B-C50C-407E-A947-70E740481C1C}">
+                          <a14:useLocalDpi xmlns:a14="http://schemas.microsoft.com/office/drawing/2010/main" val="0"/>
+                        </a:ext>
+                      </a:extLst>
+                    </a:blip>
+                    <a:stretch>
+                      <a:fillRect/>
+                    </a:stretch>
+                  </pic:blipFill>
+                  <pic:spPr>
+                    <a:xfrm>
+                      <a:off x="0" y="0"/>
+                      <a:ext cx="5400040" cy="1888490"/>
+                    </a:xfrm>
+                    <a:prstGeom prst="rect">
+                      <a:avLst/>
+                    </a:prstGeom>
+                  </pic:spPr>
+                </pic:pic>
+              </a:graphicData>
+            </a:graphic>
+          </wp:inline>
+        </w:drawing>
+      </w:r>
+    </w:p>
+    <w:p>
+      <w:pPr>
+        <w:jc w:val="both"/>
+      </w:pPr>
+      <w:r>
+        <w:t>Ponle un nombre (ej. "</w:t>
+      </w:r>
+      <w:r>
+        <w:t>Correos</w:t>
+      </w:r>
+      <w:r>
+        <w:t>") y selecciona "Cuentas en cualquier directorio organizativo" si quieres que funcione con cualquier correo de Outlook/Hotmail.</w:t>
+      </w:r>
+    </w:p>
+    <w:p>
+      <w:pPr>
+        <w:jc w:val="both"/>
+      </w:pPr>
+    </w:p>
+    <w:p>
+      <w:pPr>
+        <w:jc w:val="both"/>
+        <w:rPr>
+          <w:b/>
+          <w:bCs/>
+        </w:rPr>
+      </w:pPr>
+      <w:r>
+        <w:lastRenderedPageBreak/>
+        <w:t xml:space="preserve">Una vez rellenado el formulario, pulsamos el botón de </w:t>
+      </w:r>
+      <w:r>
+        <w:rPr>
+          <w:b/>
+          <w:bCs/>
+        </w:rPr>
+        <w:t>“Registrar Aplicación”.</w:t>
+      </w:r>
+    </w:p>
+    <w:p>
+      <w:pPr>
+        <w:jc w:val="both"/>
+        <w:rPr>
+          <w:b/>
+          <w:bCs/>
+        </w:rPr>
+      </w:pPr>
+      <w:r>
+        <w:t xml:space="preserve">Se nos abrirá una nueva ventana la cual tendrá un menú lateral izquierdo diferente, debemos de dirigirnos a la sección </w:t>
+      </w:r>
+      <w:r>
+        <w:rPr>
+          <w:b/>
+          <w:bCs/>
+        </w:rPr>
+        <w:t>Administrar -&gt; Certificados y Secretos.</w:t>
+      </w:r>
+    </w:p>
+    <w:p>
+      <w:pPr>
+        <w:jc w:val="both"/>
+        <w:rPr>
+          <w:b/>
+          <w:bCs/>
+        </w:rPr>
+      </w:pPr>
+    </w:p>
+    <w:p>
+      <w:pPr>
+        <w:jc w:val="both"/>
+        <w:rPr>
+          <w:b/>
+          <w:bCs/>
+        </w:rPr>
+      </w:pPr>
+      <w:r>
+        <w:rPr>
+          <w:b/>
+          <w:bCs/>
+          <w:noProof/>
+        </w:rPr>
+        <w:drawing>
+          <wp:inline distT="0" distB="0" distL="0" distR="0" wp14:anchorId="6BA0F488" wp14:editId="7F642BD1">
+            <wp:extent cx="2695951" cy="1733792"/>
+            <wp:effectExtent l="0" t="0" r="9525" b="0"/>
+            <wp:docPr id="1418247115" name="Imagen 8"/>
+            <wp:cNvGraphicFramePr>
+              <a:graphicFrameLocks xmlns:a="http://schemas.openxmlformats.org/drawingml/2006/main" noChangeAspect="1"/>
+            </wp:cNvGraphicFramePr>
+            <a:graphic xmlns:a="http://schemas.openxmlformats.org/drawingml/2006/main">
+              <a:graphicData uri="http://schemas.openxmlformats.org/drawingml/2006/picture">
+                <pic:pic xmlns:pic="http://schemas.openxmlformats.org/drawingml/2006/picture">
+                  <pic:nvPicPr>
+                    <pic:cNvPr id="1418247115" name="Imagen 1418247115"/>
+                    <pic:cNvPicPr/>
+                  </pic:nvPicPr>
+                  <pic:blipFill>
+                    <a:blip r:embed="rId13">
+                      <a:extLst>
+                        <a:ext uri="{28A0092B-C50C-407E-A947-70E740481C1C}">
+                          <a14:useLocalDpi xmlns:a14="http://schemas.microsoft.com/office/drawing/2010/main" val="0"/>
+                        </a:ext>
+                      </a:extLst>
+                    </a:blip>
+                    <a:stretch>
+                      <a:fillRect/>
+                    </a:stretch>
+                  </pic:blipFill>
+                  <pic:spPr>
+                    <a:xfrm>
+                      <a:off x="0" y="0"/>
+                      <a:ext cx="2695951" cy="1733792"/>
+                    </a:xfrm>
+                    <a:prstGeom prst="rect">
+                      <a:avLst/>
+                    </a:prstGeom>
+                  </pic:spPr>
+                </pic:pic>
+              </a:graphicData>
+            </a:graphic>
+          </wp:inline>
+        </w:drawing>
+      </w:r>
+    </w:p>
+    <w:p>
+      <w:pPr>
+        <w:jc w:val="both"/>
+        <w:rPr>
+          <w:b/>
+          <w:bCs/>
+        </w:rPr>
+      </w:pPr>
+    </w:p>
+    <w:p>
+      <w:pPr>
+        <w:jc w:val="both"/>
+        <w:rPr>
+          <w:b/>
+          <w:bCs/>
+        </w:rPr>
+      </w:pPr>
+      <w:r>
+        <w:t>La venta central de la página web se cambiara y veremos la sección de Certificados y Secretos, ahí debemos hacer click en</w:t>
+      </w:r>
+      <w:r>
+        <w:rPr>
+          <w:b/>
+          <w:bCs/>
+        </w:rPr>
+        <w:t xml:space="preserve"> “Nuevo Secreto de Cliente”.</w:t>
+      </w:r>
+    </w:p>
+    <w:p>
+      <w:pPr>
+        <w:jc w:val="both"/>
+        <w:rPr>
+          <w:b/>
+          <w:bCs/>
+        </w:rPr>
+      </w:pPr>
+      <w:r>
+        <w:rPr>
+          <w:b/>
+          <w:bCs/>
+          <w:noProof/>
+        </w:rPr>
+        <w:drawing>
+          <wp:inline distT="0" distB="0" distL="0" distR="0" wp14:anchorId="47EF7678" wp14:editId="175551E1">
+            <wp:extent cx="4970780" cy="1459149"/>
+            <wp:effectExtent l="0" t="0" r="1270" b="8255"/>
+            <wp:docPr id="1922116161" name="Imagen 9"/>
+            <wp:cNvGraphicFramePr>
+              <a:graphicFrameLocks xmlns:a="http://schemas.openxmlformats.org/drawingml/2006/main" noChangeAspect="1"/>
+            </wp:cNvGraphicFramePr>
+            <a:graphic xmlns:a="http://schemas.openxmlformats.org/drawingml/2006/main">
+              <a:graphicData uri="http://schemas.openxmlformats.org/drawingml/2006/picture">
+                <pic:pic xmlns:pic="http://schemas.openxmlformats.org/drawingml/2006/picture">
+                  <pic:nvPicPr>
+                    <pic:cNvPr id="1922116161" name="Imagen 1922116161"/>
+                    <pic:cNvPicPr/>
+                  </pic:nvPicPr>
+                  <pic:blipFill>
+                    <a:blip r:embed="rId14">
+                      <a:extLst>
+                        <a:ext uri="{28A0092B-C50C-407E-A947-70E740481C1C}">
+                          <a14:useLocalDpi xmlns:a14="http://schemas.microsoft.com/office/drawing/2010/main" val="0"/>
+                        </a:ext>
+                      </a:extLst>
+                    </a:blip>
+                    <a:stretch>
+                      <a:fillRect/>
+                    </a:stretch>
+                  </pic:blipFill>
+                  <pic:spPr>
+                    <a:xfrm>
+                      <a:off x="0" y="0"/>
+                      <a:ext cx="4986750" cy="1463837"/>
+                    </a:xfrm>
+                    <a:prstGeom prst="rect">
+                      <a:avLst/>
+                    </a:prstGeom>
+                  </pic:spPr>
+                </pic:pic>
+              </a:graphicData>
+            </a:graphic>
+          </wp:inline>
+        </w:drawing>
+      </w:r>
+    </w:p>
+    <w:p>
+      <w:pPr>
+        <w:jc w:val="both"/>
+      </w:pPr>
+      <w:r>
+        <w:t>Aparece un menú lateral a la derecha de nuestra ventana el cual será un formulario donde debemos introducir el nombre y caducidad del secreto.</w:t>
+      </w:r>
+    </w:p>
+    <w:p>
+      <w:pPr>
+        <w:jc w:val="both"/>
+        <w:rPr>
+          <w:b/>
+          <w:bCs/>
+        </w:rPr>
+      </w:pPr>
+      <w:r>
+        <w:rPr>
+          <w:b/>
+          <w:bCs/>
+          <w:highlight w:val="yellow"/>
+        </w:rPr>
+        <w:t>Antes de darla a registrar hay que tener en cuenta que el campo valor que aparezca hay que copiarlo rápidamente ya que si recargamos la página desaparecerá y tendremos que crear otro.</w:t>
+      </w:r>
+    </w:p>
+    <w:p>
+      <w:pPr>
+        <w:jc w:val="both"/>
+        <w:rPr>
+          <w:b/>
+          <w:bCs/>
+        </w:rPr>
+      </w:pPr>
+      <w:r>
+        <w:rPr>
+          <w:b/>
+          <w:bCs/>
+          <w:noProof/>
+        </w:rPr>
+        <w:drawing>
+          <wp:inline distT="0" distB="0" distL="0" distR="0" wp14:anchorId="44A70DFB" wp14:editId="374C8F7B">
+            <wp:extent cx="5400040" cy="1342417"/>
+            <wp:effectExtent l="0" t="0" r="0" b="0"/>
+            <wp:docPr id="853217439" name="Imagen 10"/>
+            <wp:cNvGraphicFramePr>
+              <a:graphicFrameLocks xmlns:a="http://schemas.openxmlformats.org/drawingml/2006/main" noChangeAspect="1"/>
+            </wp:cNvGraphicFramePr>
+            <a:graphic xmlns:a="http://schemas.openxmlformats.org/drawingml/2006/main">
+              <a:graphicData uri="http://schemas.openxmlformats.org/drawingml/2006/picture">
+                <pic:pic xmlns:pic="http://schemas.openxmlformats.org/drawingml/2006/picture">
+                  <pic:nvPicPr>
+                    <pic:cNvPr id="853217439" name="Imagen 853217439"/>
+                    <pic:cNvPicPr/>
+                  </pic:nvPicPr>
+                  <pic:blipFill>
+                    <a:blip r:embed="rId14">
+                      <a:extLst>
+                        <a:ext uri="{28A0092B-C50C-407E-A947-70E740481C1C}">
+                          <a14:useLocalDpi xmlns:a14="http://schemas.microsoft.com/office/drawing/2010/main" val="0"/>
+                        </a:ext>
+                      </a:extLst>
+                    </a:blip>
+                    <a:stretch>
+                      <a:fillRect/>
+                    </a:stretch>
+                  </pic:blipFill>
+                  <pic:spPr>
+                    <a:xfrm>
+                      <a:off x="0" y="0"/>
+                      <a:ext cx="5413472" cy="1345756"/>
+                    </a:xfrm>
+                    <a:prstGeom prst="rect">
+                      <a:avLst/>
+                    </a:prstGeom>
+                  </pic:spPr>
+                </pic:pic>
+              </a:graphicData>
+            </a:graphic>
+          </wp:inline>
+        </w:drawing>
+      </w:r>
+    </w:p>
+    <w:p>
+      <w:pPr>
+        <w:jc w:val="both"/>
+        <w:rPr>
+          <w:b/>
+          <w:bCs/>
+        </w:rPr>
+      </w:pPr>
+    </w:p>
+    <w:p>
+      <w:pPr>
+        <w:jc w:val="both"/>
+      </w:pPr>
+      <w:r>
+        <w:lastRenderedPageBreak/>
+        <w:t>Ya tenemos nuestro secreto de cliente listo:</w:t>
+      </w:r>
+    </w:p>
+    <w:p>
+      <w:pPr>
+        <w:jc w:val="both"/>
+        <w:rPr>
+          <w:b/>
+          <w:bCs/>
+        </w:rPr>
+      </w:pPr>
+      <w:r>
+        <w:rPr>
+          <w:b/>
+          <w:bCs/>
+          <w:noProof/>
+        </w:rPr>
+        <w:drawing>
+          <wp:inline distT="0" distB="0" distL="0" distR="0" wp14:anchorId="40E66F04" wp14:editId="5DD88DB4">
+            <wp:extent cx="5400040" cy="1964690"/>
+            <wp:effectExtent l="0" t="0" r="0" b="0"/>
+            <wp:docPr id="65684578" name="Imagen 11"/>
+            <wp:cNvGraphicFramePr>
+              <a:graphicFrameLocks xmlns:a="http://schemas.openxmlformats.org/drawingml/2006/main" noChangeAspect="1"/>
+            </wp:cNvGraphicFramePr>
+            <a:graphic xmlns:a="http://schemas.openxmlformats.org/drawingml/2006/main">
+              <a:graphicData uri="http://schemas.openxmlformats.org/drawingml/2006/picture">
+                <pic:pic xmlns:pic="http://schemas.openxmlformats.org/drawingml/2006/picture">
+                  <pic:nvPicPr>
+                    <pic:cNvPr id="65684578" name="Imagen 65684578"/>
+                    <pic:cNvPicPr/>
+                  </pic:nvPicPr>
+                  <pic:blipFill>
+                    <a:blip r:embed="rId15">
+                      <a:extLst>
+                        <a:ext uri="{28A0092B-C50C-407E-A947-70E740481C1C}">
+                          <a14:useLocalDpi xmlns:a14="http://schemas.microsoft.com/office/drawing/2010/main" val="0"/>
+                        </a:ext>
+                      </a:extLst>
+                    </a:blip>
+                    <a:stretch>
+                      <a:fillRect/>
+                    </a:stretch>
+                  </pic:blipFill>
+                  <pic:spPr>
+                    <a:xfrm>
+                      <a:off x="0" y="0"/>
+                      <a:ext cx="5400040" cy="1964690"/>
+                    </a:xfrm>
+                    <a:prstGeom prst="rect">
+                      <a:avLst/>
+                    </a:prstGeom>
+                  </pic:spPr>
+                </pic:pic>
+              </a:graphicData>
+            </a:graphic>
+          </wp:inline>
+        </w:drawing>
+      </w:r>
+    </w:p>
+    <w:p>
+      <w:pPr>
+        <w:jc w:val="both"/>
+      </w:pPr>
+      <w:r>
+        <w:t>El siguiente paso será configurar los permisos de la API, ya que Microsoft por defecto solamente nos da por defecto permisos de lectura.</w:t>
+      </w:r>
+    </w:p>
+    <w:p>
+      <w:pPr>
+        <w:jc w:val="both"/>
+      </w:pPr>
+      <w:r>
+        <w:rPr>
+          <w:noProof/>
+        </w:rPr>
+        <w:drawing>
+          <wp:inline distT="0" distB="0" distL="0" distR="0" wp14:anchorId="50CC414C" wp14:editId="7788A425">
+            <wp:extent cx="2373549" cy="1898839"/>
+            <wp:effectExtent l="0" t="0" r="8255" b="6350"/>
+            <wp:docPr id="1908635949" name="Imagen 13"/>
+            <wp:cNvGraphicFramePr>
+              <a:graphicFrameLocks xmlns:a="http://schemas.openxmlformats.org/drawingml/2006/main" noChangeAspect="1"/>
+            </wp:cNvGraphicFramePr>
+            <a:graphic xmlns:a="http://schemas.openxmlformats.org/drawingml/2006/main">
+              <a:graphicData uri="http://schemas.openxmlformats.org/drawingml/2006/picture">
+                <pic:pic xmlns:pic="http://schemas.openxmlformats.org/drawingml/2006/picture">
+                  <pic:nvPicPr>
+                    <pic:cNvPr id="1908635949" name="Imagen 1908635949"/>
+                    <pic:cNvPicPr/>
+                  </pic:nvPicPr>
+                  <pic:blipFill>
+                    <a:blip r:embed="rId16">
+                      <a:extLst>
+                        <a:ext uri="{28A0092B-C50C-407E-A947-70E740481C1C}">
+                          <a14:useLocalDpi xmlns:a14="http://schemas.microsoft.com/office/drawing/2010/main" val="0"/>
+                        </a:ext>
+                      </a:extLst>
+                    </a:blip>
+                    <a:stretch>
+                      <a:fillRect/>
+                    </a:stretch>
+                  </pic:blipFill>
+                  <pic:spPr>
+                    <a:xfrm>
+                      <a:off x="0" y="0"/>
+                      <a:ext cx="2378058" cy="1902446"/>
+                    </a:xfrm>
+                    <a:prstGeom prst="rect">
+                      <a:avLst/>
+                    </a:prstGeom>
+                  </pic:spPr>
+                </pic:pic>
+              </a:graphicData>
+            </a:graphic>
+          </wp:inline>
+        </w:drawing>
+      </w:r>
+    </w:p>
+    <w:p>
+      <w:pPr>
+        <w:jc w:val="both"/>
+      </w:pPr>
+      <w:r>
+        <w:t>Se nos abrirá la ventana central para configurar permisos , como podemos comprobar solo tenemos permisos de lectura:</w:t>
+      </w:r>
+    </w:p>
+    <w:p>
+      <w:pPr>
+        <w:jc w:val="both"/>
+      </w:pPr>
+      <w:r>
+        <w:rPr>
+          <w:noProof/>
+        </w:rPr>
+        <w:drawing>
+          <wp:inline distT="0" distB="0" distL="0" distR="0" wp14:anchorId="45747F20" wp14:editId="12449E80">
+            <wp:extent cx="5116749" cy="2312035"/>
+            <wp:effectExtent l="0" t="0" r="8255" b="0"/>
+            <wp:docPr id="27073765" name="Imagen 14"/>
+            <wp:cNvGraphicFramePr>
+              <a:graphicFrameLocks xmlns:a="http://schemas.openxmlformats.org/drawingml/2006/main" noChangeAspect="1"/>
+            </wp:cNvGraphicFramePr>
+            <a:graphic xmlns:a="http://schemas.openxmlformats.org/drawingml/2006/main">
+              <a:graphicData uri="http://schemas.openxmlformats.org/drawingml/2006/picture">
+                <pic:pic xmlns:pic="http://schemas.openxmlformats.org/drawingml/2006/picture">
+                  <pic:nvPicPr>
+                    <pic:cNvPr id="27073765" name="Imagen 27073765"/>
+                    <pic:cNvPicPr/>
+                  </pic:nvPicPr>
+                  <pic:blipFill>
+                    <a:blip r:embed="rId17">
+                      <a:extLst>
+                        <a:ext uri="{28A0092B-C50C-407E-A947-70E740481C1C}">
+                          <a14:useLocalDpi xmlns:a14="http://schemas.microsoft.com/office/drawing/2010/main" val="0"/>
+                        </a:ext>
+                      </a:extLst>
+                    </a:blip>
+                    <a:stretch>
+                      <a:fillRect/>
+                    </a:stretch>
+                  </pic:blipFill>
+                  <pic:spPr>
+                    <a:xfrm>
+                      <a:off x="0" y="0"/>
+                      <a:ext cx="5135594" cy="2320550"/>
+                    </a:xfrm>
+                    <a:prstGeom prst="rect">
+                      <a:avLst/>
+                    </a:prstGeom>
+                  </pic:spPr>
+                </pic:pic>
+              </a:graphicData>
+            </a:graphic>
+          </wp:inline>
+        </w:drawing>
+      </w:r>
+    </w:p>
+    <w:p>
+      <w:pPr>
+        <w:jc w:val="both"/>
+      </w:pPr>
+    </w:p>
+    <w:p>
+      <w:pPr>
+        <w:jc w:val="both"/>
+      </w:pPr>
+    </w:p>
+    <w:p>
+      <w:pPr>
+        <w:jc w:val="both"/>
+        <w:rPr>
+          <w:b/>
+          <w:bCs/>
+        </w:rPr>
+      </w:pPr>
+      <w:r>
+        <w:lastRenderedPageBreak/>
+        <w:t xml:space="preserve">Haremos click en el botón de </w:t>
+      </w:r>
+      <w:r>
+        <w:t>“</w:t>
+      </w:r>
+      <w:r>
+        <w:rPr>
+          <w:b/>
+          <w:bCs/>
+        </w:rPr>
+        <w:t>Agregar un permiso</w:t>
+      </w:r>
+      <w:r>
+        <w:rPr>
+          <w:b/>
+          <w:bCs/>
+        </w:rPr>
+        <w:t>”</w:t>
+      </w:r>
+      <w:r>
+        <w:rPr>
+          <w:b/>
+          <w:bCs/>
+        </w:rPr>
+        <w:t xml:space="preserve"> </w:t>
+      </w:r>
+      <w:r>
+        <w:t xml:space="preserve">y elegiremos la </w:t>
+      </w:r>
+      <w:r>
+        <w:t>opción</w:t>
+      </w:r>
+      <w:r>
+        <w:rPr>
+          <w:b/>
+          <w:bCs/>
+        </w:rPr>
+        <w:t xml:space="preserve"> “Microsoft Graph”.</w:t>
+      </w:r>
+    </w:p>
+    <w:p>
+      <w:pPr>
+        <w:jc w:val="both"/>
+      </w:pPr>
+      <w:r>
+        <w:rPr>
+          <w:noProof/>
+        </w:rPr>
+        <w:drawing>
+          <wp:inline distT="0" distB="0" distL="0" distR="0" wp14:anchorId="523BD91A" wp14:editId="237C0BCA">
+            <wp:extent cx="3998068" cy="2491105"/>
+            <wp:effectExtent l="0" t="0" r="2540" b="4445"/>
+            <wp:docPr id="2110575054" name="Imagen 15"/>
+            <wp:cNvGraphicFramePr>
+              <a:graphicFrameLocks xmlns:a="http://schemas.openxmlformats.org/drawingml/2006/main" noChangeAspect="1"/>
+            </wp:cNvGraphicFramePr>
+            <a:graphic xmlns:a="http://schemas.openxmlformats.org/drawingml/2006/main">
+              <a:graphicData uri="http://schemas.openxmlformats.org/drawingml/2006/picture">
+                <pic:pic xmlns:pic="http://schemas.openxmlformats.org/drawingml/2006/picture">
+                  <pic:nvPicPr>
+                    <pic:cNvPr id="2110575054" name="Imagen 2110575054"/>
+                    <pic:cNvPicPr/>
+                  </pic:nvPicPr>
+                  <pic:blipFill>
+                    <a:blip r:embed="rId18">
+                      <a:extLst>
+                        <a:ext uri="{28A0092B-C50C-407E-A947-70E740481C1C}">
+                          <a14:useLocalDpi xmlns:a14="http://schemas.microsoft.com/office/drawing/2010/main" val="0"/>
+                        </a:ext>
+                      </a:extLst>
+                    </a:blip>
+                    <a:stretch>
+                      <a:fillRect/>
+                    </a:stretch>
+                  </pic:blipFill>
+                  <pic:spPr>
+                    <a:xfrm>
+                      <a:off x="0" y="0"/>
+                      <a:ext cx="4012835" cy="2500306"/>
+                    </a:xfrm>
+                    <a:prstGeom prst="rect">
+                      <a:avLst/>
+                    </a:prstGeom>
+                  </pic:spPr>
+                </pic:pic>
+              </a:graphicData>
+            </a:graphic>
+          </wp:inline>
+        </w:drawing>
+      </w:r>
+    </w:p>
+    <w:p>
+      <w:pPr>
+        <w:jc w:val="both"/>
+      </w:pPr>
+    </w:p>
+    <w:p>
+      <w:pPr>
+        <w:jc w:val="both"/>
+        <w:rPr>
+          <w:b/>
+          <w:bCs/>
+        </w:rPr>
+      </w:pPr>
+      <w:r>
+        <w:rPr>
+          <w:b/>
+          <w:bCs/>
+        </w:rPr>
+        <w:t>En la siguiente ventana debemos elegir entre:</w:t>
+      </w:r>
+    </w:p>
+    <w:p>
+      <w:pPr>
+        <w:pStyle w:val="Prrafodelista"/>
+        <w:numPr>
+          <w:ilvl w:val="0"/>
+          <w:numId w:val="2"/>
+        </w:numPr>
+        <w:jc w:val="both"/>
+        <w:rPr>
+          <w:b/>
+          <w:bCs/>
+        </w:rPr>
+      </w:pPr>
+      <w:r>
+        <w:rPr>
+          <w:b/>
+          <w:bCs/>
+        </w:rPr>
+        <w:t xml:space="preserve">Permisos delegados: </w:t>
+      </w:r>
+      <w:r>
+        <w:t>El usuario debe iniciar sesión antes.</w:t>
+      </w:r>
+    </w:p>
+    <w:p>
+      <w:pPr>
+        <w:pStyle w:val="Prrafodelista"/>
+        <w:numPr>
+          <w:ilvl w:val="0"/>
+          <w:numId w:val="2"/>
+        </w:numPr>
+        <w:jc w:val="both"/>
+        <w:rPr>
+          <w:b/>
+          <w:bCs/>
+        </w:rPr>
+      </w:pPr>
+      <w:r>
+        <w:rPr>
+          <w:b/>
+          <w:bCs/>
+        </w:rPr>
+        <w:t xml:space="preserve">Permisos de aplicación: </w:t>
+      </w:r>
+      <w:r>
+        <w:t>No es necesario iniciar sesión antes.</w:t>
+      </w:r>
+    </w:p>
+    <w:p>
+      <w:pPr>
+        <w:jc w:val="both"/>
+        <w:rPr>
+          <w:b/>
+          <w:bCs/>
+        </w:rPr>
+      </w:pPr>
+    </w:p>
+    <w:p>
+      <w:pPr>
+        <w:jc w:val="both"/>
+        <w:rPr>
+          <w:b/>
+          <w:bCs/>
+        </w:rPr>
+      </w:pPr>
+      <w:r>
+        <w:t>Elegiremos el permiso</w:t>
+      </w:r>
+      <w:r>
+        <w:rPr>
+          <w:b/>
+          <w:bCs/>
+        </w:rPr>
+        <w:t xml:space="preserve"> ReadWrite.</w:t>
+      </w:r>
+    </w:p>
+    <w:p>
+      <w:pPr>
+        <w:jc w:val="both"/>
+        <w:rPr>
+          <w:b/>
+          <w:bCs/>
+        </w:rPr>
+      </w:pPr>
+      <w:r>
+        <w:rPr>
+          <w:b/>
+          <w:bCs/>
+          <w:noProof/>
+        </w:rPr>
+        <w:drawing>
+          <wp:inline distT="0" distB="0" distL="0" distR="0" wp14:anchorId="2480CE96" wp14:editId="609A108C">
+            <wp:extent cx="4674239" cy="3638145"/>
+            <wp:effectExtent l="0" t="0" r="0" b="635"/>
+            <wp:docPr id="998294149" name="Imagen 16"/>
+            <wp:cNvGraphicFramePr>
+              <a:graphicFrameLocks xmlns:a="http://schemas.openxmlformats.org/drawingml/2006/main" noChangeAspect="1"/>
+            </wp:cNvGraphicFramePr>
+            <a:graphic xmlns:a="http://schemas.openxmlformats.org/drawingml/2006/main">
+              <a:graphicData uri="http://schemas.openxmlformats.org/drawingml/2006/picture">
+                <pic:pic xmlns:pic="http://schemas.openxmlformats.org/drawingml/2006/picture">
+                  <pic:nvPicPr>
+                    <pic:cNvPr id="998294149" name="Imagen 998294149"/>
+                    <pic:cNvPicPr/>
+                  </pic:nvPicPr>
+                  <pic:blipFill>
+                    <a:blip r:embed="rId19">
+                      <a:extLst>
+                        <a:ext uri="{28A0092B-C50C-407E-A947-70E740481C1C}">
+                          <a14:useLocalDpi xmlns:a14="http://schemas.microsoft.com/office/drawing/2010/main" val="0"/>
+                        </a:ext>
+                      </a:extLst>
+                    </a:blip>
+                    <a:stretch>
+                      <a:fillRect/>
+                    </a:stretch>
+                  </pic:blipFill>
+                  <pic:spPr>
+                    <a:xfrm>
+                      <a:off x="0" y="0"/>
+                      <a:ext cx="4676598" cy="3639981"/>
+                    </a:xfrm>
+                    <a:prstGeom prst="rect">
+                      <a:avLst/>
+                    </a:prstGeom>
+                  </pic:spPr>
+                </pic:pic>
+              </a:graphicData>
+            </a:graphic>
+          </wp:inline>
+        </w:drawing>
+      </w:r>
+    </w:p>
+    <w:p>
+      <w:pPr>
+        <w:jc w:val="both"/>
+      </w:pPr>
+      <w:r>
+        <w:lastRenderedPageBreak/>
+        <w:t xml:space="preserve">Una vez elegidos los permisos, </w:t>
+      </w:r>
+      <w:r>
+        <w:t>podemos comprobar que aparece la tabla de permisos ya actualizada.</w:t>
+      </w:r>
+    </w:p>
+    <w:p>
+      <w:pPr>
+        <w:jc w:val="both"/>
+      </w:pPr>
+      <w:r>
+        <w:rPr>
+          <w:noProof/>
+        </w:rPr>
+        <w:drawing>
+          <wp:inline distT="0" distB="0" distL="0" distR="0" wp14:anchorId="35C061F9" wp14:editId="7304943F">
+            <wp:extent cx="5400040" cy="1361873"/>
+            <wp:effectExtent l="0" t="0" r="0" b="0"/>
+            <wp:docPr id="1599892652" name="Imagen 18"/>
+            <wp:cNvGraphicFramePr>
+              <a:graphicFrameLocks xmlns:a="http://schemas.openxmlformats.org/drawingml/2006/main" noChangeAspect="1"/>
+            </wp:cNvGraphicFramePr>
+            <a:graphic xmlns:a="http://schemas.openxmlformats.org/drawingml/2006/main">
+              <a:graphicData uri="http://schemas.openxmlformats.org/drawingml/2006/picture">
+                <pic:pic xmlns:pic="http://schemas.openxmlformats.org/drawingml/2006/picture">
+                  <pic:nvPicPr>
+                    <pic:cNvPr id="1599892652" name="Imagen 1599892652"/>
+                    <pic:cNvPicPr/>
+                  </pic:nvPicPr>
+                  <pic:blipFill>
+                    <a:blip r:embed="rId20">
+                      <a:extLst>
+                        <a:ext uri="{28A0092B-C50C-407E-A947-70E740481C1C}">
+                          <a14:useLocalDpi xmlns:a14="http://schemas.microsoft.com/office/drawing/2010/main" val="0"/>
+                        </a:ext>
+                      </a:extLst>
+                    </a:blip>
+                    <a:stretch>
+                      <a:fillRect/>
+                    </a:stretch>
+                  </pic:blipFill>
+                  <pic:spPr>
+                    <a:xfrm>
+                      <a:off x="0" y="0"/>
+                      <a:ext cx="5426060" cy="1368435"/>
+                    </a:xfrm>
+                    <a:prstGeom prst="rect">
+                      <a:avLst/>
+                    </a:prstGeom>
+                  </pic:spPr>
+                </pic:pic>
+              </a:graphicData>
+            </a:graphic>
+          </wp:inline>
+        </w:drawing>
+      </w:r>
+    </w:p>
+    <w:p>
+      <w:pPr>
+        <w:jc w:val="both"/>
+      </w:pPr>
+      <w:r>
+        <w:rPr>
+          <w:highlight w:val="yellow"/>
+        </w:rPr>
+        <w:t xml:space="preserve">Una vez añadido el permiso, verás un botón que dice </w:t>
+      </w:r>
+      <w:r>
+        <w:rPr>
+          <w:b/>
+          <w:bCs/>
+          <w:highlight w:val="yellow"/>
+        </w:rPr>
+        <w:t>"Conceder consentimiento de administrador para [Tu Nombre]"</w:t>
+      </w:r>
+      <w:r>
+        <w:rPr>
+          <w:highlight w:val="yellow"/>
+        </w:rPr>
+        <w:t>. Tienes que pulsarlo y decir que "Sí", de lo contrario la API te dará error 403.</w:t>
+      </w:r>
+    </w:p>
+    <w:p>
+      <w:pPr>
+        <w:jc w:val="both"/>
+      </w:pPr>
+    </w:p>
+    <w:p>
+      <w:pPr>
+        <w:jc w:val="both"/>
+      </w:pPr>
+      <w:r>
+        <w:rPr>
+          <w:noProof/>
+        </w:rPr>
+        <w:drawing>
+          <wp:inline distT="0" distB="0" distL="0" distR="0" wp14:anchorId="72D8C702" wp14:editId="472BA184">
+            <wp:extent cx="5400040" cy="861695"/>
+            <wp:effectExtent l="0" t="0" r="0" b="0"/>
+            <wp:docPr id="206417014" name="Imagen 19"/>
+            <wp:cNvGraphicFramePr>
+              <a:graphicFrameLocks xmlns:a="http://schemas.openxmlformats.org/drawingml/2006/main" noChangeAspect="1"/>
+            </wp:cNvGraphicFramePr>
+            <a:graphic xmlns:a="http://schemas.openxmlformats.org/drawingml/2006/main">
+              <a:graphicData uri="http://schemas.openxmlformats.org/drawingml/2006/picture">
+                <pic:pic xmlns:pic="http://schemas.openxmlformats.org/drawingml/2006/picture">
+                  <pic:nvPicPr>
+                    <pic:cNvPr id="206417014" name="Imagen 206417014"/>
+                    <pic:cNvPicPr/>
+                  </pic:nvPicPr>
+                  <pic:blipFill>
+                    <a:blip r:embed="rId21">
+                      <a:extLst>
+                        <a:ext uri="{28A0092B-C50C-407E-A947-70E740481C1C}">
+                          <a14:useLocalDpi xmlns:a14="http://schemas.microsoft.com/office/drawing/2010/main" val="0"/>
+                        </a:ext>
+                      </a:extLst>
+                    </a:blip>
+                    <a:stretch>
+                      <a:fillRect/>
+                    </a:stretch>
+                  </pic:blipFill>
+                  <pic:spPr>
+                    <a:xfrm>
+                      <a:off x="0" y="0"/>
+                      <a:ext cx="5400040" cy="861695"/>
+                    </a:xfrm>
+                    <a:prstGeom prst="rect">
+                      <a:avLst/>
+                    </a:prstGeom>
+                  </pic:spPr>
+                </pic:pic>
+              </a:graphicData>
+            </a:graphic>
+          </wp:inline>
+        </w:drawing>
+      </w:r>
+    </w:p>
+    <w:p>
+      <w:pPr>
+        <w:jc w:val="both"/>
+      </w:pPr>
+    </w:p>
+    <w:p>
+      <w:pPr>
+        <w:pStyle w:val="Ttulo2"/>
+      </w:pPr>
+      <w:bookmarkStart w:id="3" w:name="_Toc224294639"/>
+      <w:r>
+        <w:t>Instalación de dependencias</w:t>
+      </w:r>
+      <w:bookmarkEnd w:id="3"/>
+    </w:p>
+    <w:p>
+      <w:r>
+        <w:t>Como hemos realizado la aplicación web con PHP , debemos instalar las librerías de Microsoft con composer.</w:t>
+      </w:r>
+    </w:p>
+    <w:p>
+      <w:pPr>
+        <w:rPr>
+          <w:b/>
+          <w:bCs/>
+        </w:rPr>
+      </w:pPr>
+      <w:r>
+        <w:rPr>
+          <w:b/>
+          <w:bCs/>
+        </w:rPr>
+        <w:t>“</w:t>
+      </w:r>
+      <w:r>
+        <w:rPr>
+          <w:b/>
+          <w:bCs/>
+        </w:rPr>
+        <w:t>composer require microsoft/microsoft-graph</w:t>
+      </w:r>
+      <w:r>
+        <w:rPr>
+          <w:b/>
+          <w:bCs/>
+        </w:rPr>
+        <w:t>”</w:t>
+      </w:r>
+    </w:p>
+    <w:p>
+      <w:r>
+        <w:t>Uitlizaremos el siguiente comando, a partir de aquí debemos de realizar la codificación de nuestra aplicación Modelo – Vista – Controlador.</w:t>
+      </w:r>
     </w:p>
     <w:sectPr>
-      <w:headerReference w:type="default" r:id="rId9"/>
-      <w:footerReference w:type="default" r:id="rId10"/>
+      <w:headerReference w:type="default" r:id="rId22"/>
+      <w:footerReference w:type="default" r:id="rId23"/>
       <w:pgSz w:w="11906" w:h="16838"/>
       <w:pgMar w:top="1417" w:right="1701" w:bottom="1417" w:left="1701" w:header="708" w:footer="708" w:gutter="0"/>
       <w:pgNumType w:start="0"/>
@@ -1366,9 +2791,9 @@
 <file path=word/numbering.xml><?xml version="1.0" encoding="utf-8"?>
 <w:numbering xmlns:wpc="http://schemas.microsoft.com/office/word/2010/wordprocessingCanvas" xmlns:cx="http://schemas.microsoft.com/office/drawing/2014/chartex" xmlns:cx1="http://schemas.microsoft.com/office/drawing/2015/9/8/chartex" xmlns:cx2="http://schemas.microsoft.com/office/drawing/2015/10/21/chartex" xmlns:cx3="http://schemas.microsoft.com/office/drawing/2016/5/9/chartex" xmlns:cx4="http://schemas.microsoft.com/office/drawing/2016/5/10/chartex" xmlns:cx5="http://schemas.microsoft.com/office/drawing/2016/5/11/chartex" xmlns:cx6="http://schemas.microsoft.com/office/drawing/2016/5/12/chartex" xmlns:cx7="http://schemas.microsoft.com/office/drawing/2016/5/13/chartex" xmlns:cx8="http://schemas.microsoft.com/office/drawing/2016/5/14/chartex" xmlns:mc="http://schemas.openxmlformats.org/markup-compatibility/2006" xmlns:aink="http://schemas.microsoft.com/office/drawing/2016/ink" xmlns:am3d="http://schemas.microsoft.com/office/drawing/2017/model3d" xmlns:o="urn:schemas-microsoft-com:office:office" xmlns:oel="http://schemas.microsoft.com/office/2019/extlst" xmlns:r="http://schemas.openxmlformats.org/officeDocument/2006/relationships" xmlns:m="http://schemas.openxmlformats.org/officeDocument/2006/math" xmlns:v="urn:schemas-microsoft-com:vml" xmlns:wp14="http://schemas.microsoft.com/office/word/2010/wordprocessingDrawing" xmlns:wp="http://schemas.openxmlformats.org/drawingml/2006/wordprocessingDrawing" xmlns:w10="urn:schemas-microsoft-com:office:word" xmlns:w="http://schemas.openxmlformats.org/wordprocessingml/2006/main" xmlns:w14="http://schemas.microsoft.com/office/word/2010/wordml" xmlns:w15="http://schemas.microsoft.com/office/word/2012/wordml" xmlns:w16cex="http://schemas.microsoft.com/office/word/2018/wordml/cex" xmlns:w16cid="http://schemas.microsoft.com/office/word/2016/wordml/cid" xmlns:w16="http://schemas.microsoft.com/office/word/2018/wordml" xmlns:w16du="http://schemas.microsoft.com/office/word/2023/wordml/word16du" xmlns:w16sdtdh="http://schemas.microsoft.com/office/word/2020/wordml/sdtdatahash" xmlns:w16sdtfl="http://schemas.microsoft.com/office/word/2024/wordml/sdtformatlock" xmlns:w16se="http://schemas.microsoft.com/office/word/2015/wordml/symex" xmlns:wpg="http://schemas.microsoft.com/office/word/2010/wordprocessingGroup" xmlns:wpi="http://schemas.microsoft.com/office/word/2010/wordprocessingInk" xmlns:wne="http://schemas.microsoft.com/office/word/2006/wordml" xmlns:wps="http://schemas.microsoft.com/office/word/2010/wordprocessingShape" mc:Ignorable="w14 w15 w16se w16cid w16 w16cex w16sdtdh w16sdtfl w16du wp14">
   <w:abstractNum w:abstractNumId="0" w15:restartNumberingAfterBreak="0">
-    <w:nsid w:val="33336FFB"/>
+    <w:nsid w:val="006547B3"/>
     <w:multiLevelType w:val="hybridMultilevel"/>
-    <w:tmpl w:val="640486D2"/>
+    <w:tmpl w:val="E146C12A"/>
     <w:lvl w:ilvl="0" w:tplc="0C0A0001">
       <w:start w:val="1"/>
       <w:numFmt w:val="bullet"/>
@@ -1478,7 +2903,123 @@
       </w:rPr>
     </w:lvl>
   </w:abstractNum>
+  <w:abstractNum w:abstractNumId="1" w15:restartNumberingAfterBreak="0">
+    <w:nsid w:val="33336FFB"/>
+    <w:multiLevelType w:val="hybridMultilevel"/>
+    <w:tmpl w:val="640486D2"/>
+    <w:lvl w:ilvl="0" w:tplc="0C0A0001">
+      <w:start w:val="1"/>
+      <w:numFmt w:val="bullet"/>
+      <w:lvlText w:val=""/>
+      <w:lvlJc w:val="left"/>
+      <w:pPr>
+        <w:ind w:left="720" w:hanging="360"/>
+      </w:pPr>
+      <w:rPr>
+        <w:rFonts w:ascii="Symbol" w:hAnsi="Symbol" w:hint="default"/>
+      </w:rPr>
+    </w:lvl>
+    <w:lvl w:ilvl="1" w:tplc="0C0A0003" w:tentative="1">
+      <w:start w:val="1"/>
+      <w:numFmt w:val="bullet"/>
+      <w:lvlText w:val="o"/>
+      <w:lvlJc w:val="left"/>
+      <w:pPr>
+        <w:ind w:left="1440" w:hanging="360"/>
+      </w:pPr>
+      <w:rPr>
+        <w:rFonts w:ascii="Courier New" w:hAnsi="Courier New" w:cs="Courier New" w:hint="default"/>
+      </w:rPr>
+    </w:lvl>
+    <w:lvl w:ilvl="2" w:tplc="0C0A0005" w:tentative="1">
+      <w:start w:val="1"/>
+      <w:numFmt w:val="bullet"/>
+      <w:lvlText w:val=""/>
+      <w:lvlJc w:val="left"/>
+      <w:pPr>
+        <w:ind w:left="2160" w:hanging="360"/>
+      </w:pPr>
+      <w:rPr>
+        <w:rFonts w:ascii="Wingdings" w:hAnsi="Wingdings" w:hint="default"/>
+      </w:rPr>
+    </w:lvl>
+    <w:lvl w:ilvl="3" w:tplc="0C0A0001" w:tentative="1">
+      <w:start w:val="1"/>
+      <w:numFmt w:val="bullet"/>
+      <w:lvlText w:val=""/>
+      <w:lvlJc w:val="left"/>
+      <w:pPr>
+        <w:ind w:left="2880" w:hanging="360"/>
+      </w:pPr>
+      <w:rPr>
+        <w:rFonts w:ascii="Symbol" w:hAnsi="Symbol" w:hint="default"/>
+      </w:rPr>
+    </w:lvl>
+    <w:lvl w:ilvl="4" w:tplc="0C0A0003" w:tentative="1">
+      <w:start w:val="1"/>
+      <w:numFmt w:val="bullet"/>
+      <w:lvlText w:val="o"/>
+      <w:lvlJc w:val="left"/>
+      <w:pPr>
+        <w:ind w:left="3600" w:hanging="360"/>
+      </w:pPr>
+      <w:rPr>
+        <w:rFonts w:ascii="Courier New" w:hAnsi="Courier New" w:cs="Courier New" w:hint="default"/>
+      </w:rPr>
+    </w:lvl>
+    <w:lvl w:ilvl="5" w:tplc="0C0A0005" w:tentative="1">
+      <w:start w:val="1"/>
+      <w:numFmt w:val="bullet"/>
+      <w:lvlText w:val=""/>
+      <w:lvlJc w:val="left"/>
+      <w:pPr>
+        <w:ind w:left="4320" w:hanging="360"/>
+      </w:pPr>
+      <w:rPr>
+        <w:rFonts w:ascii="Wingdings" w:hAnsi="Wingdings" w:hint="default"/>
+      </w:rPr>
+    </w:lvl>
+    <w:lvl w:ilvl="6" w:tplc="0C0A0001" w:tentative="1">
+      <w:start w:val="1"/>
+      <w:numFmt w:val="bullet"/>
+      <w:lvlText w:val=""/>
+      <w:lvlJc w:val="left"/>
+      <w:pPr>
+        <w:ind w:left="5040" w:hanging="360"/>
+      </w:pPr>
+      <w:rPr>
+        <w:rFonts w:ascii="Symbol" w:hAnsi="Symbol" w:hint="default"/>
+      </w:rPr>
+    </w:lvl>
+    <w:lvl w:ilvl="7" w:tplc="0C0A0003" w:tentative="1">
+      <w:start w:val="1"/>
+      <w:numFmt w:val="bullet"/>
+      <w:lvlText w:val="o"/>
+      <w:lvlJc w:val="left"/>
+      <w:pPr>
+        <w:ind w:left="5760" w:hanging="360"/>
+      </w:pPr>
+      <w:rPr>
+        <w:rFonts w:ascii="Courier New" w:hAnsi="Courier New" w:cs="Courier New" w:hint="default"/>
+      </w:rPr>
+    </w:lvl>
+    <w:lvl w:ilvl="8" w:tplc="0C0A0005" w:tentative="1">
+      <w:start w:val="1"/>
+      <w:numFmt w:val="bullet"/>
+      <w:lvlText w:val=""/>
+      <w:lvlJc w:val="left"/>
+      <w:pPr>
+        <w:ind w:left="6480" w:hanging="360"/>
+      </w:pPr>
+      <w:rPr>
+        <w:rFonts w:ascii="Wingdings" w:hAnsi="Wingdings" w:hint="default"/>
+      </w:rPr>
+    </w:lvl>
+  </w:abstractNum>
   <w:num w:numId="1" w16cid:durableId="460347512">
+    <w:abstractNumId w:val="1"/>
+  </w:num>
+  <w:num w:numId="2" w16cid:durableId="323314290">
     <w:abstractNumId w:val="0"/>
   </w:num>
 </w:numbering>
@@ -2498,6 +4039,39 @@
       <w:shd w:val="clear" w:color="auto" w:fill="E1DFDD"/>
     </w:rPr>
   </w:style>
+  <w:style w:type="paragraph" w:styleId="TtuloTDC">
+    <w:name w:val="TOC Heading"/>
+    <w:basedOn w:val="Ttulo1"/>
+    <w:next w:val="Normal"/>
+    <w:uiPriority w:val="39"/>
+    <w:unhideWhenUsed/>
+    <w:qFormat/>
+    <w:rsid w:val="00BA4CA6"/>
+    <w:pPr>
+      <w:spacing w:before="240" w:after="0" w:line="259" w:lineRule="auto"/>
+      <w:outlineLvl w:val="9"/>
+    </w:pPr>
+    <w:rPr>
+      <w:kern w:val="0"/>
+      <w:sz w:val="32"/>
+      <w:szCs w:val="32"/>
+      <w:lang w:eastAsia="es-ES"/>
+      <w14:ligatures w14:val="none"/>
+    </w:rPr>
+  </w:style>
+  <w:style w:type="paragraph" w:styleId="TDC2">
+    <w:name w:val="toc 2"/>
+    <w:basedOn w:val="Normal"/>
+    <w:next w:val="Normal"/>
+    <w:autoRedefine/>
+    <w:uiPriority w:val="39"/>
+    <w:unhideWhenUsed/>
+    <w:rsid w:val="00BA4CA6"/>
+    <w:pPr>
+      <w:spacing w:after="100"/>
+      <w:ind w:left="240"/>
+    </w:pPr>
+  </w:style>
 </w:styles>
 </file>
 
@@ -2600,8 +4174,11 @@
   <w:rsids>
     <w:rsidRoot w:val="00BF0638"/>
     <w:rsid w:val="00250C01"/>
+    <w:rsid w:val="003B3F98"/>
+    <w:rsid w:val="00504BA5"/>
     <w:rsid w:val="00B025B5"/>
     <w:rsid w:val="00BF0638"/>
+    <w:rsid w:val="00F653D7"/>
   </w:rsids>
   <m:mathPr>
     <m:mathFont m:val="Cambria Math"/>
@@ -3389,4 +4966,16 @@
     </a:ext>
   </a:extLst>
 </a:theme>
+</file>
+
+<file path=customXml/item1.xml><?xml version="1.0" encoding="utf-8"?>
+<b:Sources xmlns:b="http://schemas.openxmlformats.org/officeDocument/2006/bibliography" xmlns="http://schemas.openxmlformats.org/officeDocument/2006/bibliography" SelectedStyle="\APASixthEditionOfficeOnline.xsl" StyleName="APA" Version="6"/>
+</file>
+
+<file path=customXml/itemProps1.xml><?xml version="1.0" encoding="utf-8"?>
+<ds:datastoreItem xmlns:ds="http://schemas.openxmlformats.org/officeDocument/2006/customXml" ds:itemID="{F901EED3-CA1D-478C-B9BE-A99F3CCA8EB5}">
+  <ds:schemaRefs>
+    <ds:schemaRef ds:uri="http://schemas.openxmlformats.org/officeDocument/2006/bibliography"/>
+  </ds:schemaRefs>
+</ds:datastoreItem>
 </file>
</xml_diff>